<commit_message>
docs : updated the reprt for image 1 with its problem solution and output
</commit_message>
<xml_diff>
--- a/report/icv report.docx
+++ b/report/icv report.docx
@@ -1652,6 +1652,1043 @@
       <w:bookmarkEnd w:id="3"/>
     </w:p>
     <w:p/>
+    <w:p>
+      <w:pPr>
+        <w:ind w:left="605"/>
+        <w:rPr>
+          <w:rFonts w:asciiTheme="minorHAnsi" w:hAnsiTheme="minorHAnsi" w:cstheme="minorHAnsi"/>
+        </w:rPr>
+      </w:pPr>
+      <w:r>
+        <w:rPr>
+          <w:rFonts w:asciiTheme="minorHAnsi" w:hAnsiTheme="minorHAnsi" w:cstheme="minorHAnsi"/>
+        </w:rPr>
+        <w:t>Problem in the image</w:t>
+      </w:r>
+    </w:p>
+    <w:p>
+      <w:pPr>
+        <w:ind w:left="605"/>
+        <w:rPr>
+          <w:rFonts w:asciiTheme="minorHAnsi" w:hAnsiTheme="minorHAnsi" w:cstheme="minorHAnsi"/>
+        </w:rPr>
+      </w:pPr>
+      <w:r>
+        <w:rPr>
+          <w:rFonts w:asciiTheme="minorHAnsi" w:hAnsiTheme="minorHAnsi" w:cstheme="minorHAnsi"/>
+        </w:rPr>
+        <w:t>The main issue identified in Image1.jpg was the presence of an excessive green tint throughout the image. The lighting condition caused the image colours to appear unnatura</w:t>
+      </w:r>
+      <w:r>
+        <w:rPr>
+          <w:rFonts w:asciiTheme="minorHAnsi" w:hAnsiTheme="minorHAnsi" w:cstheme="minorHAnsi"/>
+        </w:rPr>
+        <w:t>l  as the green colour made image contrast uneven in the picture.</w:t>
+      </w:r>
+    </w:p>
+    <w:p>
+      <w:pPr>
+        <w:pStyle w:val="Standard"/>
+        <w:ind w:left="605"/>
+        <w:jc w:val="center"/>
+        <w:rPr>
+          <w:rFonts w:asciiTheme="minorHAnsi" w:hAnsiTheme="minorHAnsi" w:cstheme="minorHAnsi"/>
+          <w:sz w:val="22"/>
+          <w:szCs w:val="22"/>
+        </w:rPr>
+      </w:pPr>
+    </w:p>
+    <w:p>
+      <w:pPr>
+        <w:ind w:left="605"/>
+        <w:rPr>
+          <w:rFonts w:asciiTheme="minorHAnsi" w:hAnsiTheme="minorHAnsi" w:cstheme="minorHAnsi"/>
+        </w:rPr>
+      </w:pPr>
+      <w:r>
+        <w:tab/>
+      </w:r>
+      <w:r>
+        <w:rPr>
+          <w:rFonts w:asciiTheme="minorHAnsi" w:hAnsiTheme="minorHAnsi" w:cstheme="minorHAnsi"/>
+        </w:rPr>
+        <w:t>Solution Implemented:</w:t>
+      </w:r>
+    </w:p>
+    <w:p>
+      <w:pPr>
+        <w:ind w:left="605"/>
+        <w:jc w:val="both"/>
+        <w:rPr>
+          <w:rFonts w:asciiTheme="minorHAnsi" w:hAnsiTheme="minorHAnsi" w:cstheme="minorHAnsi"/>
+          <w:lang w:val="en-US"/>
+        </w:rPr>
+      </w:pPr>
+      <w:r>
+        <w:rPr>
+          <w:rFonts w:asciiTheme="minorHAnsi" w:hAnsiTheme="minorHAnsi" w:cstheme="minorHAnsi"/>
+          <w:lang w:val="en-US"/>
+        </w:rPr>
+        <w:t xml:space="preserve">The image was first loaded and converted to grayscale to </w:t>
+      </w:r>
+      <w:proofErr w:type="spellStart"/>
+      <w:r>
+        <w:rPr>
+          <w:rFonts w:asciiTheme="minorHAnsi" w:hAnsiTheme="minorHAnsi" w:cstheme="minorHAnsi"/>
+          <w:lang w:val="en-US"/>
+        </w:rPr>
+        <w:t>analyse</w:t>
+      </w:r>
+      <w:proofErr w:type="spellEnd"/>
+      <w:r>
+        <w:rPr>
+          <w:rFonts w:asciiTheme="minorHAnsi" w:hAnsiTheme="minorHAnsi" w:cstheme="minorHAnsi"/>
+          <w:lang w:val="en-US"/>
+        </w:rPr>
+        <w:t xml:space="preserve"> brightness distribution using a histogram, which showed most pixels in darker regions. A gamma-based adjustment using </w:t>
+      </w:r>
+      <w:proofErr w:type="spellStart"/>
+      <w:r>
+        <w:rPr>
+          <w:rFonts w:asciiTheme="minorHAnsi" w:hAnsiTheme="minorHAnsi" w:cstheme="minorHAnsi"/>
+          <w:lang w:val="en-US"/>
+        </w:rPr>
+        <w:t>imadjust</w:t>
+      </w:r>
+      <w:proofErr w:type="spellEnd"/>
+      <w:r>
+        <w:rPr>
+          <w:rFonts w:asciiTheme="minorHAnsi" w:hAnsiTheme="minorHAnsi" w:cstheme="minorHAnsi"/>
+          <w:lang w:val="en-US"/>
+        </w:rPr>
+        <w:t xml:space="preserve">() was then applied to brighten the image, followed by histogram </w:t>
+      </w:r>
+      <w:proofErr w:type="spellStart"/>
+      <w:r>
+        <w:rPr>
+          <w:rFonts w:asciiTheme="minorHAnsi" w:hAnsiTheme="minorHAnsi" w:cstheme="minorHAnsi"/>
+          <w:lang w:val="en-US"/>
+        </w:rPr>
+        <w:t>equalisation</w:t>
+      </w:r>
+      <w:proofErr w:type="spellEnd"/>
+      <w:r>
+        <w:rPr>
+          <w:rFonts w:asciiTheme="minorHAnsi" w:hAnsiTheme="minorHAnsi" w:cstheme="minorHAnsi"/>
+          <w:lang w:val="en-US"/>
+        </w:rPr>
+        <w:t xml:space="preserve"> (</w:t>
+      </w:r>
+      <w:proofErr w:type="spellStart"/>
+      <w:r>
+        <w:rPr>
+          <w:rFonts w:asciiTheme="minorHAnsi" w:hAnsiTheme="minorHAnsi" w:cstheme="minorHAnsi"/>
+          <w:lang w:val="en-US"/>
+        </w:rPr>
+        <w:t>histeq</w:t>
+      </w:r>
+      <w:proofErr w:type="spellEnd"/>
+      <w:r>
+        <w:rPr>
+          <w:rFonts w:asciiTheme="minorHAnsi" w:hAnsiTheme="minorHAnsi" w:cstheme="minorHAnsi"/>
+          <w:lang w:val="en-US"/>
+        </w:rPr>
+        <w:t xml:space="preserve">()) to improve contrast. Finally, </w:t>
+      </w:r>
+      <w:proofErr w:type="spellStart"/>
+      <w:r>
+        <w:rPr>
+          <w:rFonts w:asciiTheme="minorHAnsi" w:hAnsiTheme="minorHAnsi" w:cstheme="minorHAnsi"/>
+          <w:lang w:val="en-US"/>
+        </w:rPr>
+        <w:t>colour</w:t>
+      </w:r>
+      <w:proofErr w:type="spellEnd"/>
+      <w:r>
+        <w:rPr>
+          <w:rFonts w:asciiTheme="minorHAnsi" w:hAnsiTheme="minorHAnsi" w:cstheme="minorHAnsi"/>
+          <w:lang w:val="en-US"/>
+        </w:rPr>
+        <w:t xml:space="preserve"> correction was performed by reducing the green channel and boosting red and blue channels to remove the green cast and produce a more natural-looking image.</w:t>
+      </w:r>
+    </w:p>
+    <w:p>
+      <w:pPr>
+        <w:ind w:left="605"/>
+        <w:jc w:val="both"/>
+        <w:rPr>
+          <w:rFonts w:asciiTheme="minorHAnsi" w:hAnsiTheme="minorHAnsi" w:cstheme="minorHAnsi"/>
+          <w:lang w:val="en-US"/>
+        </w:rPr>
+      </w:pPr>
+    </w:p>
+    <w:p>
+      <w:pPr>
+        <w:ind w:left="605"/>
+        <w:jc w:val="both"/>
+        <w:rPr>
+          <w:rFonts w:asciiTheme="minorHAnsi" w:hAnsiTheme="minorHAnsi" w:cstheme="minorHAnsi"/>
+          <w:lang w:val="en-US"/>
+        </w:rPr>
+      </w:pPr>
+    </w:p>
+    <w:p>
+      <w:pPr>
+        <w:ind w:left="605"/>
+        <w:jc w:val="both"/>
+        <w:rPr>
+          <w:rFonts w:asciiTheme="minorHAnsi" w:hAnsiTheme="minorHAnsi" w:cstheme="minorHAnsi"/>
+          <w:lang w:val="en-US"/>
+        </w:rPr>
+      </w:pPr>
+    </w:p>
+    <w:p>
+      <w:pPr>
+        <w:ind w:left="605"/>
+        <w:jc w:val="both"/>
+        <w:rPr>
+          <w:rFonts w:asciiTheme="minorHAnsi" w:hAnsiTheme="minorHAnsi" w:cstheme="minorHAnsi"/>
+          <w:lang w:val="en-US"/>
+        </w:rPr>
+      </w:pPr>
+    </w:p>
+    <w:p>
+      <w:pPr>
+        <w:ind w:left="605"/>
+        <w:jc w:val="both"/>
+        <w:rPr>
+          <w:rFonts w:asciiTheme="minorHAnsi" w:hAnsiTheme="minorHAnsi" w:cstheme="minorHAnsi"/>
+          <w:lang w:val="en-US"/>
+        </w:rPr>
+      </w:pPr>
+    </w:p>
+    <w:p>
+      <w:pPr>
+        <w:ind w:left="605"/>
+        <w:jc w:val="both"/>
+        <w:rPr>
+          <w:rFonts w:asciiTheme="minorHAnsi" w:hAnsiTheme="minorHAnsi" w:cstheme="minorHAnsi"/>
+          <w:lang w:val="en-US"/>
+        </w:rPr>
+      </w:pPr>
+    </w:p>
+    <w:p>
+      <w:pPr>
+        <w:ind w:left="605"/>
+        <w:jc w:val="both"/>
+        <w:rPr>
+          <w:rFonts w:asciiTheme="minorHAnsi" w:hAnsiTheme="minorHAnsi" w:cstheme="minorHAnsi"/>
+          <w:lang w:val="en-US"/>
+        </w:rPr>
+      </w:pPr>
+    </w:p>
+    <w:p>
+      <w:pPr>
+        <w:ind w:left="605"/>
+        <w:jc w:val="both"/>
+        <w:rPr>
+          <w:rFonts w:asciiTheme="minorHAnsi" w:hAnsiTheme="minorHAnsi" w:cstheme="minorHAnsi"/>
+          <w:lang w:val="en-US"/>
+        </w:rPr>
+      </w:pPr>
+    </w:p>
+    <w:p>
+      <w:pPr>
+        <w:ind w:left="605"/>
+        <w:jc w:val="both"/>
+        <w:rPr>
+          <w:rFonts w:asciiTheme="minorHAnsi" w:hAnsiTheme="minorHAnsi" w:cstheme="minorHAnsi"/>
+          <w:lang w:val="en-US"/>
+        </w:rPr>
+      </w:pPr>
+    </w:p>
+    <w:p>
+      <w:pPr>
+        <w:ind w:left="605"/>
+        <w:jc w:val="both"/>
+        <w:rPr>
+          <w:rFonts w:asciiTheme="minorHAnsi" w:hAnsiTheme="minorHAnsi" w:cstheme="minorHAnsi"/>
+          <w:lang w:val="en-US"/>
+        </w:rPr>
+      </w:pPr>
+      <w:r>
+        <w:rPr>
+          <w:rFonts w:asciiTheme="minorHAnsi" w:hAnsiTheme="minorHAnsi" w:cstheme="minorHAnsi"/>
+          <w:lang w:val="en-US"/>
+        </w:rPr>
+        <w:t xml:space="preserve">Step1: load the image in </w:t>
+      </w:r>
+      <w:proofErr w:type="spellStart"/>
+      <w:r>
+        <w:rPr>
+          <w:rFonts w:asciiTheme="minorHAnsi" w:hAnsiTheme="minorHAnsi" w:cstheme="minorHAnsi"/>
+          <w:lang w:val="en-US"/>
+        </w:rPr>
+        <w:t>matlab</w:t>
+      </w:r>
+      <w:proofErr w:type="spellEnd"/>
+    </w:p>
+    <w:p>
+      <w:pPr>
+        <w:keepNext/>
+        <w:ind w:left="605"/>
+        <w:jc w:val="both"/>
+      </w:pPr>
+      <w:r>
+        <w:rPr>
+          <w:noProof/>
+        </w:rPr>
+        <w:drawing>
+          <wp:inline distT="0" distB="0" distL="0" distR="0" wp14:anchorId="1F8CD85D" wp14:editId="795534F5">
+            <wp:extent cx="5622925" cy="4137660"/>
+            <wp:effectExtent l="0" t="0" r="0" b="0"/>
+            <wp:docPr id="61347089" name="Picture 1"/>
+            <wp:cNvGraphicFramePr>
+              <a:graphicFrameLocks xmlns:a="http://schemas.openxmlformats.org/drawingml/2006/main" noChangeAspect="1"/>
+            </wp:cNvGraphicFramePr>
+            <a:graphic xmlns:a="http://schemas.openxmlformats.org/drawingml/2006/main">
+              <a:graphicData uri="http://schemas.openxmlformats.org/drawingml/2006/picture">
+                <pic:pic xmlns:pic="http://schemas.openxmlformats.org/drawingml/2006/picture">
+                  <pic:nvPicPr>
+                    <pic:cNvPr id="534675943" name=""/>
+                    <pic:cNvPicPr/>
+                  </pic:nvPicPr>
+                  <pic:blipFill>
+                    <a:blip r:embed="rId6"/>
+                    <a:stretch>
+                      <a:fillRect/>
+                    </a:stretch>
+                  </pic:blipFill>
+                  <pic:spPr>
+                    <a:xfrm>
+                      <a:off x="0" y="0"/>
+                      <a:ext cx="5626584" cy="4140352"/>
+                    </a:xfrm>
+                    <a:prstGeom prst="rect">
+                      <a:avLst/>
+                    </a:prstGeom>
+                  </pic:spPr>
+                </pic:pic>
+              </a:graphicData>
+            </a:graphic>
+          </wp:inline>
+        </w:drawing>
+      </w:r>
+    </w:p>
+    <w:p>
+      <w:pPr>
+        <w:pStyle w:val="Caption"/>
+        <w:ind w:left="605"/>
+        <w:jc w:val="both"/>
+        <w:rPr>
+          <w:rFonts w:asciiTheme="minorHAnsi" w:hAnsiTheme="minorHAnsi" w:cstheme="minorHAnsi"/>
+          <w:lang w:val="en-US"/>
+        </w:rPr>
+      </w:pPr>
+      <w:r>
+        <w:tab/>
+      </w:r>
+      <w:r>
+        <w:tab/>
+      </w:r>
+      <w:r>
+        <w:tab/>
+      </w:r>
+      <w:r>
+        <w:tab/>
+        <w:t xml:space="preserve">Figure </w:t>
+      </w:r>
+      <w:r>
+        <w:fldChar w:fldCharType="begin"/>
+      </w:r>
+      <w:r>
+        <w:instrText xml:space="preserve"> SEQ Figure \* ARABIC </w:instrText>
+      </w:r>
+      <w:r>
+        <w:fldChar w:fldCharType="separate"/>
+      </w:r>
+      <w:r>
+        <w:rPr>
+          <w:noProof/>
+        </w:rPr>
+        <w:t>1</w:t>
+      </w:r>
+      <w:r>
+        <w:fldChar w:fldCharType="end"/>
+      </w:r>
+      <w:r>
+        <w:t xml:space="preserve">: </w:t>
+      </w:r>
+      <w:proofErr w:type="spellStart"/>
+      <w:r>
+        <w:t>orginal</w:t>
+      </w:r>
+      <w:proofErr w:type="spellEnd"/>
+      <w:r>
+        <w:t xml:space="preserve"> image1.jpg</w:t>
+      </w:r>
+    </w:p>
+    <w:p>
+      <w:pPr>
+        <w:ind w:left="605"/>
+        <w:jc w:val="both"/>
+        <w:rPr>
+          <w:rFonts w:asciiTheme="minorHAnsi" w:hAnsiTheme="minorHAnsi" w:cstheme="minorHAnsi"/>
+          <w:lang w:val="en-US"/>
+        </w:rPr>
+      </w:pPr>
+    </w:p>
+    <w:p>
+      <w:pPr>
+        <w:ind w:left="605"/>
+        <w:jc w:val="both"/>
+        <w:rPr>
+          <w:rFonts w:asciiTheme="minorHAnsi" w:hAnsiTheme="minorHAnsi" w:cstheme="minorHAnsi"/>
+          <w:lang w:val="en-US"/>
+        </w:rPr>
+      </w:pPr>
+      <w:r>
+        <w:rPr>
+          <w:rFonts w:asciiTheme="minorHAnsi" w:hAnsiTheme="minorHAnsi" w:cstheme="minorHAnsi"/>
+          <w:lang w:val="en-US"/>
+        </w:rPr>
+        <w:t>Step2: Grey scale histogram:</w:t>
+      </w:r>
+    </w:p>
+    <w:p>
+      <w:pPr>
+        <w:ind w:left="605"/>
+        <w:jc w:val="both"/>
+        <w:rPr>
+          <w:rFonts w:asciiTheme="minorHAnsi" w:hAnsiTheme="minorHAnsi" w:cstheme="minorHAnsi"/>
+        </w:rPr>
+      </w:pPr>
+      <w:r>
+        <w:rPr>
+          <w:rFonts w:asciiTheme="minorHAnsi" w:hAnsiTheme="minorHAnsi" w:cstheme="minorHAnsi"/>
+        </w:rPr>
+        <w:t>Converts the image to grayscale and plots a histogram to show how pixel intensities are distributed. Most pixels in the dark region indicate a low-brightness image.</w:t>
+      </w:r>
+    </w:p>
+    <w:p>
+      <w:pPr>
+        <w:keepNext/>
+        <w:ind w:left="605"/>
+        <w:jc w:val="both"/>
+      </w:pPr>
+      <w:r>
+        <w:rPr>
+          <w:rFonts w:asciiTheme="minorHAnsi" w:hAnsiTheme="minorHAnsi" w:cstheme="minorHAnsi"/>
+          <w:noProof/>
+          <w:lang w:val="en-US"/>
+        </w:rPr>
+        <w:lastRenderedPageBreak/>
+        <w:drawing>
+          <wp:inline distT="0" distB="0" distL="0" distR="0" wp14:anchorId="54DD9EA7" wp14:editId="551C4C0D">
+            <wp:extent cx="5806440" cy="2918460"/>
+            <wp:effectExtent l="0" t="0" r="3810" b="0"/>
+            <wp:docPr id="1609994341" name="Picture 1"/>
+            <wp:cNvGraphicFramePr>
+              <a:graphicFrameLocks xmlns:a="http://schemas.openxmlformats.org/drawingml/2006/main" noChangeAspect="1"/>
+            </wp:cNvGraphicFramePr>
+            <a:graphic xmlns:a="http://schemas.openxmlformats.org/drawingml/2006/main">
+              <a:graphicData uri="http://schemas.openxmlformats.org/drawingml/2006/picture">
+                <pic:pic xmlns:pic="http://schemas.openxmlformats.org/drawingml/2006/picture">
+                  <pic:nvPicPr>
+                    <pic:cNvPr id="1609994341" name=""/>
+                    <pic:cNvPicPr/>
+                  </pic:nvPicPr>
+                  <pic:blipFill>
+                    <a:blip r:embed="rId7"/>
+                    <a:stretch>
+                      <a:fillRect/>
+                    </a:stretch>
+                  </pic:blipFill>
+                  <pic:spPr>
+                    <a:xfrm>
+                      <a:off x="0" y="0"/>
+                      <a:ext cx="5806440" cy="2918460"/>
+                    </a:xfrm>
+                    <a:prstGeom prst="rect">
+                      <a:avLst/>
+                    </a:prstGeom>
+                  </pic:spPr>
+                </pic:pic>
+              </a:graphicData>
+            </a:graphic>
+          </wp:inline>
+        </w:drawing>
+      </w:r>
+    </w:p>
+    <w:p>
+      <w:pPr>
+        <w:pStyle w:val="Caption"/>
+        <w:ind w:left="605"/>
+        <w:jc w:val="both"/>
+        <w:rPr>
+          <w:rFonts w:asciiTheme="minorHAnsi" w:hAnsiTheme="minorHAnsi" w:cstheme="minorHAnsi"/>
+          <w:lang w:val="en-US"/>
+        </w:rPr>
+      </w:pPr>
+      <w:r>
+        <w:tab/>
+      </w:r>
+      <w:r>
+        <w:tab/>
+      </w:r>
+      <w:r>
+        <w:tab/>
+      </w:r>
+      <w:r>
+        <w:tab/>
+      </w:r>
+      <w:r>
+        <w:tab/>
+        <w:t xml:space="preserve">Figure </w:t>
+      </w:r>
+      <w:r>
+        <w:fldChar w:fldCharType="begin"/>
+      </w:r>
+      <w:r>
+        <w:instrText xml:space="preserve"> SEQ Figure \* ARABIC </w:instrText>
+      </w:r>
+      <w:r>
+        <w:fldChar w:fldCharType="separate"/>
+      </w:r>
+      <w:r>
+        <w:rPr>
+          <w:noProof/>
+        </w:rPr>
+        <w:t>2</w:t>
+      </w:r>
+      <w:r>
+        <w:fldChar w:fldCharType="end"/>
+      </w:r>
+      <w:r>
+        <w:t>: histogram of image 1</w:t>
+      </w:r>
+    </w:p>
+    <w:p>
+      <w:pPr>
+        <w:ind w:left="605"/>
+        <w:jc w:val="both"/>
+        <w:rPr>
+          <w:rFonts w:asciiTheme="minorHAnsi" w:hAnsiTheme="minorHAnsi" w:cstheme="minorHAnsi"/>
+          <w:lang w:val="en-US"/>
+        </w:rPr>
+      </w:pPr>
+    </w:p>
+    <w:p>
+      <w:pPr>
+        <w:ind w:left="605"/>
+        <w:jc w:val="both"/>
+        <w:rPr>
+          <w:rFonts w:asciiTheme="minorHAnsi" w:hAnsiTheme="minorHAnsi" w:cstheme="minorHAnsi"/>
+          <w:lang w:val="en-US"/>
+        </w:rPr>
+      </w:pPr>
+    </w:p>
+    <w:p>
+      <w:pPr>
+        <w:ind w:left="605"/>
+        <w:jc w:val="both"/>
+        <w:rPr>
+          <w:rFonts w:asciiTheme="minorHAnsi" w:hAnsiTheme="minorHAnsi" w:cstheme="minorHAnsi"/>
+        </w:rPr>
+      </w:pPr>
+      <w:r>
+        <w:rPr>
+          <w:rFonts w:asciiTheme="minorHAnsi" w:hAnsiTheme="minorHAnsi" w:cstheme="minorHAnsi"/>
+          <w:lang w:val="en-US"/>
+        </w:rPr>
+        <w:t>Step3:</w:t>
+      </w:r>
+      <w:r>
+        <w:rPr>
+          <w:rFonts w:asciiTheme="minorHAnsi" w:hAnsiTheme="minorHAnsi" w:cstheme="minorHAnsi"/>
+        </w:rPr>
+        <w:t xml:space="preserve">Brightness </w:t>
+      </w:r>
+      <w:proofErr w:type="spellStart"/>
+      <w:r>
+        <w:rPr>
+          <w:rFonts w:asciiTheme="minorHAnsi" w:hAnsiTheme="minorHAnsi" w:cstheme="minorHAnsi"/>
+        </w:rPr>
+        <w:t>adjustemnt</w:t>
+      </w:r>
+      <w:proofErr w:type="spellEnd"/>
+    </w:p>
+    <w:p>
+      <w:pPr>
+        <w:ind w:left="605"/>
+        <w:jc w:val="both"/>
+        <w:rPr>
+          <w:rFonts w:asciiTheme="minorHAnsi" w:hAnsiTheme="minorHAnsi" w:cstheme="minorHAnsi"/>
+        </w:rPr>
+      </w:pPr>
+      <w:r>
+        <w:rPr>
+          <w:rFonts w:asciiTheme="minorHAnsi" w:hAnsiTheme="minorHAnsi" w:cstheme="minorHAnsi"/>
+        </w:rPr>
+        <w:t xml:space="preserve">Uses </w:t>
+      </w:r>
+      <w:proofErr w:type="spellStart"/>
+      <w:r>
+        <w:rPr>
+          <w:rFonts w:asciiTheme="minorHAnsi" w:hAnsiTheme="minorHAnsi" w:cstheme="minorHAnsi"/>
+        </w:rPr>
+        <w:t>imadjust</w:t>
+      </w:r>
+      <w:proofErr w:type="spellEnd"/>
+      <w:r>
+        <w:rPr>
+          <w:rFonts w:asciiTheme="minorHAnsi" w:hAnsiTheme="minorHAnsi" w:cstheme="minorHAnsi"/>
+        </w:rPr>
+        <w:t xml:space="preserve"> with gamma = 0.5 to brighten the image, making dark areas more visible.</w:t>
+      </w:r>
+    </w:p>
+    <w:p>
+      <w:pPr>
+        <w:keepNext/>
+        <w:ind w:left="605"/>
+        <w:jc w:val="both"/>
+      </w:pPr>
+      <w:r>
+        <w:rPr>
+          <w:rFonts w:asciiTheme="minorHAnsi" w:hAnsiTheme="minorHAnsi" w:cstheme="minorHAnsi"/>
+          <w:b/>
+          <w:bCs/>
+          <w:noProof/>
+        </w:rPr>
+        <w:drawing>
+          <wp:inline distT="0" distB="0" distL="0" distR="0" wp14:anchorId="399E7154" wp14:editId="0E6E7EDB">
+            <wp:extent cx="5257800" cy="3940175"/>
+            <wp:effectExtent l="0" t="0" r="0" b="3175"/>
+            <wp:docPr id="1068118148" name="Picture 1"/>
+            <wp:cNvGraphicFramePr>
+              <a:graphicFrameLocks xmlns:a="http://schemas.openxmlformats.org/drawingml/2006/main" noChangeAspect="1"/>
+            </wp:cNvGraphicFramePr>
+            <a:graphic xmlns:a="http://schemas.openxmlformats.org/drawingml/2006/main">
+              <a:graphicData uri="http://schemas.openxmlformats.org/drawingml/2006/picture">
+                <pic:pic xmlns:pic="http://schemas.openxmlformats.org/drawingml/2006/picture">
+                  <pic:nvPicPr>
+                    <pic:cNvPr id="1068118148" name=""/>
+                    <pic:cNvPicPr/>
+                  </pic:nvPicPr>
+                  <pic:blipFill>
+                    <a:blip r:embed="rId8"/>
+                    <a:stretch>
+                      <a:fillRect/>
+                    </a:stretch>
+                  </pic:blipFill>
+                  <pic:spPr>
+                    <a:xfrm>
+                      <a:off x="0" y="0"/>
+                      <a:ext cx="5257800" cy="3940175"/>
+                    </a:xfrm>
+                    <a:prstGeom prst="rect">
+                      <a:avLst/>
+                    </a:prstGeom>
+                  </pic:spPr>
+                </pic:pic>
+              </a:graphicData>
+            </a:graphic>
+          </wp:inline>
+        </w:drawing>
+      </w:r>
+    </w:p>
+    <w:p>
+      <w:pPr>
+        <w:pStyle w:val="Caption"/>
+        <w:ind w:left="605"/>
+        <w:jc w:val="both"/>
+        <w:rPr>
+          <w:rFonts w:asciiTheme="minorHAnsi" w:hAnsiTheme="minorHAnsi" w:cstheme="minorHAnsi"/>
+          <w:b/>
+          <w:bCs/>
+        </w:rPr>
+      </w:pPr>
+      <w:r>
+        <w:tab/>
+      </w:r>
+      <w:r>
+        <w:tab/>
+      </w:r>
+      <w:r>
+        <w:tab/>
+      </w:r>
+      <w:r>
+        <w:tab/>
+        <w:t xml:space="preserve">Figure </w:t>
+      </w:r>
+      <w:r>
+        <w:fldChar w:fldCharType="begin"/>
+      </w:r>
+      <w:r>
+        <w:instrText xml:space="preserve"> SEQ Figure \* ARABIC </w:instrText>
+      </w:r>
+      <w:r>
+        <w:fldChar w:fldCharType="separate"/>
+      </w:r>
+      <w:r>
+        <w:rPr>
+          <w:noProof/>
+        </w:rPr>
+        <w:t>3</w:t>
+      </w:r>
+      <w:r>
+        <w:fldChar w:fldCharType="end"/>
+      </w:r>
+      <w:r>
+        <w:t xml:space="preserve"> : image 1 after brightness adjusted</w:t>
+      </w:r>
+    </w:p>
+    <w:p>
+      <w:pPr>
+        <w:ind w:left="605"/>
+        <w:jc w:val="both"/>
+        <w:rPr>
+          <w:rFonts w:asciiTheme="minorHAnsi" w:hAnsiTheme="minorHAnsi" w:cstheme="minorHAnsi"/>
+          <w:b/>
+          <w:bCs/>
+        </w:rPr>
+      </w:pPr>
+    </w:p>
+    <w:p>
+      <w:pPr>
+        <w:ind w:left="605"/>
+        <w:jc w:val="both"/>
+        <w:rPr>
+          <w:rFonts w:asciiTheme="minorHAnsi" w:hAnsiTheme="minorHAnsi" w:cstheme="minorHAnsi"/>
+        </w:rPr>
+      </w:pPr>
+      <w:r>
+        <w:rPr>
+          <w:rFonts w:asciiTheme="minorHAnsi" w:hAnsiTheme="minorHAnsi" w:cstheme="minorHAnsi"/>
+        </w:rPr>
+        <w:t>Step</w:t>
+      </w:r>
+      <w:r>
+        <w:rPr>
+          <w:rFonts w:asciiTheme="minorHAnsi" w:hAnsiTheme="minorHAnsi" w:cstheme="minorHAnsi"/>
+        </w:rPr>
+        <w:t xml:space="preserve"> 4: histogram equalization</w:t>
+      </w:r>
+    </w:p>
+    <w:p>
+      <w:pPr>
+        <w:ind w:left="605"/>
+        <w:jc w:val="both"/>
+        <w:rPr>
+          <w:rFonts w:asciiTheme="minorHAnsi" w:hAnsiTheme="minorHAnsi" w:cstheme="minorHAnsi"/>
+          <w:b/>
+          <w:bCs/>
+        </w:rPr>
+      </w:pPr>
+      <w:r>
+        <w:rPr>
+          <w:rFonts w:asciiTheme="minorHAnsi" w:hAnsiTheme="minorHAnsi" w:cstheme="minorHAnsi"/>
+        </w:rPr>
+        <w:t xml:space="preserve">Applies </w:t>
+      </w:r>
+      <w:proofErr w:type="spellStart"/>
+      <w:r>
+        <w:rPr>
+          <w:rFonts w:asciiTheme="minorHAnsi" w:hAnsiTheme="minorHAnsi" w:cstheme="minorHAnsi"/>
+        </w:rPr>
+        <w:t>histeq</w:t>
+      </w:r>
+      <w:proofErr w:type="spellEnd"/>
+      <w:r>
+        <w:rPr>
+          <w:rFonts w:asciiTheme="minorHAnsi" w:hAnsiTheme="minorHAnsi" w:cstheme="minorHAnsi"/>
+        </w:rPr>
+        <w:t xml:space="preserve"> to improve image contrast by spreading intensity values more evenly across the histogram</w:t>
+      </w:r>
+      <w:r>
+        <w:rPr>
+          <w:rFonts w:asciiTheme="minorHAnsi" w:hAnsiTheme="minorHAnsi" w:cstheme="minorHAnsi"/>
+          <w:b/>
+          <w:bCs/>
+        </w:rPr>
+        <w:t>.</w:t>
+      </w:r>
+    </w:p>
+    <w:p>
+      <w:pPr>
+        <w:keepNext/>
+        <w:ind w:left="605"/>
+        <w:jc w:val="both"/>
+      </w:pPr>
+      <w:r>
+        <w:rPr>
+          <w:rFonts w:asciiTheme="minorHAnsi" w:hAnsiTheme="minorHAnsi" w:cstheme="minorHAnsi"/>
+          <w:b/>
+          <w:bCs/>
+          <w:noProof/>
+        </w:rPr>
+        <w:drawing>
+          <wp:inline distT="0" distB="0" distL="0" distR="0" wp14:anchorId="40055B25" wp14:editId="28866E23">
+            <wp:extent cx="5433060" cy="3101340"/>
+            <wp:effectExtent l="0" t="0" r="0" b="3810"/>
+            <wp:docPr id="678845667" name="Picture 1"/>
+            <wp:cNvGraphicFramePr>
+              <a:graphicFrameLocks xmlns:a="http://schemas.openxmlformats.org/drawingml/2006/main" noChangeAspect="1"/>
+            </wp:cNvGraphicFramePr>
+            <a:graphic xmlns:a="http://schemas.openxmlformats.org/drawingml/2006/main">
+              <a:graphicData uri="http://schemas.openxmlformats.org/drawingml/2006/picture">
+                <pic:pic xmlns:pic="http://schemas.openxmlformats.org/drawingml/2006/picture">
+                  <pic:nvPicPr>
+                    <pic:cNvPr id="678845667" name=""/>
+                    <pic:cNvPicPr/>
+                  </pic:nvPicPr>
+                  <pic:blipFill>
+                    <a:blip r:embed="rId9"/>
+                    <a:stretch>
+                      <a:fillRect/>
+                    </a:stretch>
+                  </pic:blipFill>
+                  <pic:spPr>
+                    <a:xfrm>
+                      <a:off x="0" y="0"/>
+                      <a:ext cx="5433060" cy="3101340"/>
+                    </a:xfrm>
+                    <a:prstGeom prst="rect">
+                      <a:avLst/>
+                    </a:prstGeom>
+                  </pic:spPr>
+                </pic:pic>
+              </a:graphicData>
+            </a:graphic>
+          </wp:inline>
+        </w:drawing>
+      </w:r>
+    </w:p>
+    <w:p>
+      <w:pPr>
+        <w:pStyle w:val="Caption"/>
+        <w:ind w:left="605"/>
+        <w:jc w:val="both"/>
+        <w:rPr>
+          <w:rFonts w:asciiTheme="minorHAnsi" w:hAnsiTheme="minorHAnsi" w:cstheme="minorHAnsi"/>
+          <w:b/>
+          <w:bCs/>
+        </w:rPr>
+      </w:pPr>
+      <w:r>
+        <w:tab/>
+      </w:r>
+      <w:r>
+        <w:tab/>
+      </w:r>
+      <w:r>
+        <w:tab/>
+        <w:t xml:space="preserve">Figure </w:t>
+      </w:r>
+      <w:r>
+        <w:fldChar w:fldCharType="begin"/>
+      </w:r>
+      <w:r>
+        <w:instrText xml:space="preserve"> SEQ Figure \* ARABIC </w:instrText>
+      </w:r>
+      <w:r>
+        <w:fldChar w:fldCharType="separate"/>
+      </w:r>
+      <w:r>
+        <w:rPr>
+          <w:noProof/>
+        </w:rPr>
+        <w:t>4</w:t>
+      </w:r>
+      <w:r>
+        <w:fldChar w:fldCharType="end"/>
+      </w:r>
+      <w:r>
+        <w:t>: image 1 after histogram equalization</w:t>
+      </w:r>
+    </w:p>
+    <w:p>
+      <w:pPr>
+        <w:pStyle w:val="Caption"/>
+        <w:keepNext/>
+        <w:ind w:left="605"/>
+        <w:jc w:val="center"/>
+      </w:pPr>
+    </w:p>
+    <w:p>
+      <w:pPr>
+        <w:ind w:left="605"/>
+        <w:rPr>
+          <w:rFonts w:asciiTheme="minorHAnsi" w:hAnsiTheme="minorHAnsi" w:cstheme="minorHAnsi"/>
+        </w:rPr>
+      </w:pPr>
+      <w:r>
+        <w:rPr>
+          <w:rFonts w:asciiTheme="minorHAnsi" w:hAnsiTheme="minorHAnsi" w:cstheme="minorHAnsi"/>
+        </w:rPr>
+        <w:t xml:space="preserve">Output </w:t>
+      </w:r>
+    </w:p>
+    <w:p>
+      <w:pPr>
+        <w:pStyle w:val="Caption"/>
+        <w:ind w:left="605"/>
+        <w:jc w:val="both"/>
+        <w:rPr>
+          <w:rFonts w:asciiTheme="minorHAnsi" w:hAnsiTheme="minorHAnsi" w:cstheme="minorHAnsi"/>
+          <w:i w:val="0"/>
+          <w:iCs w:val="0"/>
+        </w:rPr>
+      </w:pPr>
+      <w:r>
+        <w:rPr>
+          <w:rFonts w:asciiTheme="minorHAnsi" w:hAnsiTheme="minorHAnsi" w:cstheme="minorHAnsi"/>
+          <w:i w:val="0"/>
+          <w:iCs w:val="0"/>
+        </w:rPr>
+        <w:t>The output produced was a colour</w:t>
+      </w:r>
+      <w:r>
+        <w:rPr>
+          <w:rFonts w:asciiTheme="minorHAnsi" w:hAnsiTheme="minorHAnsi" w:cstheme="minorHAnsi"/>
+          <w:i w:val="0"/>
+          <w:iCs w:val="0"/>
+        </w:rPr>
+        <w:t xml:space="preserve"> </w:t>
+      </w:r>
+      <w:r>
+        <w:rPr>
+          <w:rFonts w:asciiTheme="minorHAnsi" w:hAnsiTheme="minorHAnsi" w:cstheme="minorHAnsi"/>
+          <w:i w:val="0"/>
+          <w:iCs w:val="0"/>
+        </w:rPr>
+        <w:t xml:space="preserve">balanced image where the green cast was successfully removed. The lab coat appeared white and the </w:t>
+      </w:r>
+      <w:r>
+        <w:rPr>
+          <w:rFonts w:asciiTheme="minorHAnsi" w:hAnsiTheme="minorHAnsi" w:cstheme="minorHAnsi"/>
+          <w:i w:val="0"/>
+          <w:iCs w:val="0"/>
+        </w:rPr>
+        <w:t>pant</w:t>
+      </w:r>
+      <w:r>
+        <w:rPr>
+          <w:rFonts w:asciiTheme="minorHAnsi" w:hAnsiTheme="minorHAnsi" w:cstheme="minorHAnsi"/>
+          <w:i w:val="0"/>
+          <w:iCs w:val="0"/>
+        </w:rPr>
+        <w:t xml:space="preserve"> on the table showed more natural and true colours</w:t>
+      </w:r>
+      <w:r>
+        <w:rPr>
+          <w:rFonts w:asciiTheme="minorHAnsi" w:hAnsiTheme="minorHAnsi" w:cstheme="minorHAnsi"/>
+          <w:i w:val="0"/>
+          <w:iCs w:val="0"/>
+        </w:rPr>
+        <w:t>.</w:t>
+      </w:r>
+    </w:p>
+    <w:p>
+      <w:pPr>
+        <w:pStyle w:val="Caption"/>
+        <w:keepNext/>
+        <w:ind w:left="605"/>
+        <w:jc w:val="both"/>
+      </w:pPr>
+      <w:r>
+        <w:rPr>
+          <w:rFonts w:asciiTheme="minorHAnsi" w:hAnsiTheme="minorHAnsi" w:cstheme="minorHAnsi"/>
+          <w:i w:val="0"/>
+          <w:iCs w:val="0"/>
+          <w:noProof/>
+        </w:rPr>
+        <w:lastRenderedPageBreak/>
+        <w:drawing>
+          <wp:inline distT="0" distB="0" distL="0" distR="0" wp14:anchorId="483C0A6F" wp14:editId="4269165F">
+            <wp:extent cx="5059680" cy="2948940"/>
+            <wp:effectExtent l="0" t="0" r="7620" b="3810"/>
+            <wp:docPr id="2085882968" name="Picture 1"/>
+            <wp:cNvGraphicFramePr>
+              <a:graphicFrameLocks xmlns:a="http://schemas.openxmlformats.org/drawingml/2006/main" noChangeAspect="1"/>
+            </wp:cNvGraphicFramePr>
+            <a:graphic xmlns:a="http://schemas.openxmlformats.org/drawingml/2006/main">
+              <a:graphicData uri="http://schemas.openxmlformats.org/drawingml/2006/picture">
+                <pic:pic xmlns:pic="http://schemas.openxmlformats.org/drawingml/2006/picture">
+                  <pic:nvPicPr>
+                    <pic:cNvPr id="2085882968" name=""/>
+                    <pic:cNvPicPr/>
+                  </pic:nvPicPr>
+                  <pic:blipFill>
+                    <a:blip r:embed="rId10"/>
+                    <a:stretch>
+                      <a:fillRect/>
+                    </a:stretch>
+                  </pic:blipFill>
+                  <pic:spPr>
+                    <a:xfrm>
+                      <a:off x="0" y="0"/>
+                      <a:ext cx="5059680" cy="2948940"/>
+                    </a:xfrm>
+                    <a:prstGeom prst="rect">
+                      <a:avLst/>
+                    </a:prstGeom>
+                  </pic:spPr>
+                </pic:pic>
+              </a:graphicData>
+            </a:graphic>
+          </wp:inline>
+        </w:drawing>
+      </w:r>
+    </w:p>
+    <w:p>
+      <w:pPr>
+        <w:pStyle w:val="Caption"/>
+        <w:ind w:left="605"/>
+        <w:jc w:val="both"/>
+        <w:rPr>
+          <w:rFonts w:asciiTheme="minorHAnsi" w:hAnsiTheme="minorHAnsi" w:cstheme="minorHAnsi"/>
+          <w:i w:val="0"/>
+          <w:iCs w:val="0"/>
+        </w:rPr>
+      </w:pPr>
+      <w:r>
+        <w:tab/>
+      </w:r>
+      <w:r>
+        <w:tab/>
+      </w:r>
+      <w:r>
+        <w:tab/>
+      </w:r>
+      <w:r>
+        <w:tab/>
+        <w:t xml:space="preserve">Figure </w:t>
+      </w:r>
+      <w:r>
+        <w:fldChar w:fldCharType="begin"/>
+      </w:r>
+      <w:r>
+        <w:instrText xml:space="preserve"> SEQ Figure \* ARABIC </w:instrText>
+      </w:r>
+      <w:r>
+        <w:fldChar w:fldCharType="separate"/>
+      </w:r>
+      <w:r>
+        <w:rPr>
+          <w:noProof/>
+        </w:rPr>
+        <w:t>5</w:t>
+      </w:r>
+      <w:r>
+        <w:fldChar w:fldCharType="end"/>
+      </w:r>
+      <w:r>
+        <w:t>: image 1 output after processing</w:t>
+      </w:r>
+    </w:p>
+    <w:p/>
+    <w:p/>
     <w:sectPr>
       <w:pgSz w:w="12240" w:h="15840"/>
       <w:pgMar w:top="1440" w:right="1440" w:bottom="1440" w:left="1440" w:header="720" w:footer="720" w:gutter="0"/>
@@ -1811,7 +2848,7 @@
     <w:lsdException w:name="header" w:semiHidden="1" w:unhideWhenUsed="1"/>
     <w:lsdException w:name="footer" w:semiHidden="1" w:unhideWhenUsed="1"/>
     <w:lsdException w:name="index heading" w:semiHidden="1" w:unhideWhenUsed="1"/>
-    <w:lsdException w:name="caption" w:semiHidden="1" w:uiPriority="35" w:unhideWhenUsed="1" w:qFormat="1"/>
+    <w:lsdException w:name="caption" w:semiHidden="1" w:uiPriority="0" w:unhideWhenUsed="1" w:qFormat="1"/>
     <w:lsdException w:name="table of figures" w:semiHidden="1" w:unhideWhenUsed="1"/>
     <w:lsdException w:name="envelope address" w:semiHidden="1" w:unhideWhenUsed="1"/>
     <w:lsdException w:name="envelope return" w:semiHidden="1" w:unhideWhenUsed="1"/>
@@ -2796,6 +3833,19 @@
       <w:szCs w:val="21"/>
     </w:rPr>
   </w:style>
+  <w:style w:type="paragraph" w:styleId="Caption">
+    <w:name w:val="caption"/>
+    <w:basedOn w:val="Standard"/>
+    <w:rsid w:val="0051211F"/>
+    <w:pPr>
+      <w:suppressLineNumbers/>
+      <w:spacing w:before="120" w:after="120"/>
+    </w:pPr>
+    <w:rPr>
+      <w:i/>
+      <w:iCs/>
+    </w:rPr>
+  </w:style>
 </w:styles>
 </file>
 

</xml_diff>

<commit_message>
docs : updated the reprt for image 2 and 3 with its problem solution and output
</commit_message>
<xml_diff>
--- a/report/icv report.docx
+++ b/report/icv report.docx
@@ -2646,12 +2646,270 @@
         <w:pStyle w:val="Caption"/>
         <w:ind w:left="605"/>
         <w:jc w:val="both"/>
+      </w:pPr>
+      <w:r>
+        <w:tab/>
+      </w:r>
+      <w:r>
+        <w:tab/>
+      </w:r>
+      <w:r>
+        <w:tab/>
+      </w:r>
+      <w:r>
+        <w:tab/>
+        <w:t xml:space="preserve">Figure </w:t>
+      </w:r>
+      <w:r>
+        <w:fldChar w:fldCharType="begin"/>
+      </w:r>
+      <w:r>
+        <w:instrText xml:space="preserve"> SEQ Figure \* ARABIC </w:instrText>
+      </w:r>
+      <w:r>
+        <w:fldChar w:fldCharType="separate"/>
+      </w:r>
+      <w:r>
+        <w:rPr>
+          <w:noProof/>
+        </w:rPr>
+        <w:t>5</w:t>
+      </w:r>
+      <w:r>
+        <w:fldChar w:fldCharType="end"/>
+      </w:r>
+      <w:r>
+        <w:t>: image 1 output after processing</w:t>
+      </w:r>
+    </w:p>
+    <w:p>
+      <w:pPr>
+        <w:pStyle w:val="Caption"/>
+        <w:ind w:left="605"/>
+        <w:jc w:val="both"/>
+      </w:pPr>
+    </w:p>
+    <w:p>
+      <w:pPr>
+        <w:pStyle w:val="Caption"/>
+        <w:ind w:left="605"/>
+        <w:jc w:val="both"/>
         <w:rPr>
           <w:rFonts w:asciiTheme="minorHAnsi" w:hAnsiTheme="minorHAnsi" w:cstheme="minorHAnsi"/>
           <w:i w:val="0"/>
           <w:iCs w:val="0"/>
         </w:rPr>
       </w:pPr>
+    </w:p>
+    <w:p>
+      <w:pPr>
+        <w:pStyle w:val="Heading2"/>
+        <w:ind w:left="605"/>
+      </w:pPr>
+      <w:bookmarkStart w:id="4" w:name="_Toc229761576"/>
+      <w:r>
+        <w:t>2.2 A</w:t>
+      </w:r>
+      <w:r>
+        <w:t>nalysis and processing of Image2.jpg</w:t>
+      </w:r>
+      <w:bookmarkEnd w:id="4"/>
+    </w:p>
+    <w:p>
+      <w:pPr>
+        <w:ind w:left="605"/>
+        <w:rPr>
+          <w:rFonts w:asciiTheme="minorHAnsi" w:hAnsiTheme="minorHAnsi" w:cstheme="minorHAnsi"/>
+        </w:rPr>
+      </w:pPr>
+      <w:r>
+        <w:rPr>
+          <w:rFonts w:asciiTheme="minorHAnsi" w:hAnsiTheme="minorHAnsi" w:cstheme="minorHAnsi"/>
+        </w:rPr>
+        <w:t>Problem in the Image:</w:t>
+      </w:r>
+    </w:p>
+    <w:p>
+      <w:pPr>
+        <w:ind w:left="605"/>
+        <w:rPr>
+          <w:rFonts w:asciiTheme="minorHAnsi" w:hAnsiTheme="minorHAnsi" w:cstheme="minorHAnsi"/>
+          <w:lang w:val="en-US"/>
+        </w:rPr>
+      </w:pPr>
+      <w:r>
+        <w:rPr>
+          <w:rFonts w:asciiTheme="minorHAnsi" w:hAnsiTheme="minorHAnsi" w:cstheme="minorHAnsi"/>
+          <w:lang w:val="en-US"/>
+        </w:rPr>
+        <w:t>Image2.JPG exhibits significant defocus blur. The image appears uniformly blurred, suggesting the camera was not properly focused at the time of capture. This type of blur is characterized by a disc-shaped (circular) point spread function (PSF).</w:t>
+      </w:r>
+    </w:p>
+    <w:p>
+      <w:pPr>
+        <w:ind w:left="605"/>
+        <w:rPr>
+          <w:rFonts w:asciiTheme="minorHAnsi" w:hAnsiTheme="minorHAnsi" w:cstheme="minorHAnsi"/>
+        </w:rPr>
+      </w:pPr>
+    </w:p>
+    <w:p>
+      <w:pPr>
+        <w:ind w:left="605"/>
+        <w:rPr>
+          <w:rFonts w:asciiTheme="minorHAnsi" w:hAnsiTheme="minorHAnsi" w:cstheme="minorHAnsi"/>
+        </w:rPr>
+      </w:pPr>
+      <w:r>
+        <w:rPr>
+          <w:rFonts w:asciiTheme="minorHAnsi" w:hAnsiTheme="minorHAnsi" w:cstheme="minorHAnsi"/>
+        </w:rPr>
+        <w:t>Solution Implemented:</w:t>
+      </w:r>
+    </w:p>
+    <w:p>
+      <w:pPr>
+        <w:ind w:left="605"/>
+        <w:rPr>
+          <w:rFonts w:asciiTheme="minorHAnsi" w:hAnsiTheme="minorHAnsi" w:cstheme="minorHAnsi"/>
+        </w:rPr>
+      </w:pPr>
+      <w:r>
+        <w:rPr>
+          <w:rFonts w:asciiTheme="minorHAnsi" w:hAnsiTheme="minorHAnsi" w:cstheme="minorHAnsi"/>
+        </w:rPr>
+        <w:t xml:space="preserve">The image was first loaded and converted to grayscale to analyse its intensity distribution using a histogram, revealing blur-related loss of detail. Sharpening was then applied using </w:t>
+      </w:r>
+      <w:proofErr w:type="spellStart"/>
+      <w:r>
+        <w:rPr>
+          <w:rFonts w:asciiTheme="minorHAnsi" w:hAnsiTheme="minorHAnsi" w:cstheme="minorHAnsi"/>
+        </w:rPr>
+        <w:t>imsharpen</w:t>
+      </w:r>
+      <w:proofErr w:type="spellEnd"/>
+      <w:r>
+        <w:rPr>
+          <w:rFonts w:asciiTheme="minorHAnsi" w:hAnsiTheme="minorHAnsi" w:cstheme="minorHAnsi"/>
+        </w:rPr>
+        <w:t>() with a large radius and high amount to enhance edge clarity and partially restore lost focus. To further improve restoration, Wiener deconvolution was performed using a Gaussian point spread function to reduce blur effects, followed by a motion-based Wiener deconvolution for comparison. Finally, Sobel edge detection was applied before and after sharpening, showing that edges became significantly clearer after enhancement and deblurring.</w:t>
+      </w:r>
+    </w:p>
+    <w:p>
+      <w:pPr>
+        <w:ind w:left="605"/>
+        <w:rPr>
+          <w:rFonts w:asciiTheme="minorHAnsi" w:hAnsiTheme="minorHAnsi" w:cstheme="minorHAnsi"/>
+        </w:rPr>
+      </w:pPr>
+    </w:p>
+    <w:p>
+      <w:pPr>
+        <w:ind w:left="605"/>
+        <w:rPr>
+          <w:rFonts w:asciiTheme="minorHAnsi" w:hAnsiTheme="minorHAnsi" w:cstheme="minorHAnsi"/>
+          <w:lang w:val="en-US"/>
+        </w:rPr>
+      </w:pPr>
+      <w:r>
+        <w:rPr>
+          <w:rFonts w:asciiTheme="minorHAnsi" w:hAnsiTheme="minorHAnsi" w:cstheme="minorHAnsi"/>
+          <w:lang w:val="en-US"/>
+        </w:rPr>
+        <w:t>Step 1</w:t>
+      </w:r>
+      <w:r>
+        <w:rPr>
+          <w:rFonts w:asciiTheme="minorHAnsi" w:hAnsiTheme="minorHAnsi" w:cstheme="minorHAnsi"/>
+          <w:lang w:val="en-US"/>
+        </w:rPr>
+        <w:t>-</w:t>
+      </w:r>
+      <w:r>
+        <w:rPr>
+          <w:rFonts w:asciiTheme="minorHAnsi" w:hAnsiTheme="minorHAnsi" w:cstheme="minorHAnsi"/>
+          <w:lang w:val="en-US"/>
+        </w:rPr>
+        <w:t xml:space="preserve"> Original Image Display: </w:t>
+      </w:r>
+    </w:p>
+    <w:p>
+      <w:pPr>
+        <w:ind w:left="605"/>
+        <w:rPr>
+          <w:rFonts w:asciiTheme="minorHAnsi" w:hAnsiTheme="minorHAnsi" w:cstheme="minorHAnsi"/>
+          <w:lang w:val="en-US"/>
+        </w:rPr>
+      </w:pPr>
+      <w:r>
+        <w:rPr>
+          <w:rFonts w:asciiTheme="minorHAnsi" w:hAnsiTheme="minorHAnsi" w:cstheme="minorHAnsi"/>
+          <w:lang w:val="en-US"/>
+        </w:rPr>
+        <w:t>The blurred input image was loaded and displayed to observe the out-of-focus degradation.</w:t>
+      </w:r>
+    </w:p>
+    <w:p>
+      <w:pPr>
+        <w:keepNext/>
+        <w:ind w:left="605"/>
+      </w:pPr>
+      <w:r>
+        <w:rPr>
+          <w:rFonts w:asciiTheme="minorHAnsi" w:hAnsiTheme="minorHAnsi" w:cstheme="minorHAnsi"/>
+          <w:noProof/>
+          <w:lang w:val="en-US"/>
+        </w:rPr>
+        <w:lastRenderedPageBreak/>
+        <w:drawing>
+          <wp:inline distT="0" distB="0" distL="0" distR="0" wp14:anchorId="4C61D40D" wp14:editId="6010C505">
+            <wp:extent cx="5303520" cy="4345940"/>
+            <wp:effectExtent l="0" t="0" r="0" b="0"/>
+            <wp:docPr id="810129817" name="Picture 1"/>
+            <wp:cNvGraphicFramePr>
+              <a:graphicFrameLocks xmlns:a="http://schemas.openxmlformats.org/drawingml/2006/main" noChangeAspect="1"/>
+            </wp:cNvGraphicFramePr>
+            <a:graphic xmlns:a="http://schemas.openxmlformats.org/drawingml/2006/main">
+              <a:graphicData uri="http://schemas.openxmlformats.org/drawingml/2006/picture">
+                <pic:pic xmlns:pic="http://schemas.openxmlformats.org/drawingml/2006/picture">
+                  <pic:nvPicPr>
+                    <pic:cNvPr id="810129817" name=""/>
+                    <pic:cNvPicPr/>
+                  </pic:nvPicPr>
+                  <pic:blipFill>
+                    <a:blip r:embed="rId11"/>
+                    <a:stretch>
+                      <a:fillRect/>
+                    </a:stretch>
+                  </pic:blipFill>
+                  <pic:spPr>
+                    <a:xfrm>
+                      <a:off x="0" y="0"/>
+                      <a:ext cx="5303520" cy="4345940"/>
+                    </a:xfrm>
+                    <a:prstGeom prst="rect">
+                      <a:avLst/>
+                    </a:prstGeom>
+                  </pic:spPr>
+                </pic:pic>
+              </a:graphicData>
+            </a:graphic>
+          </wp:inline>
+        </w:drawing>
+      </w:r>
+    </w:p>
+    <w:p>
+      <w:pPr>
+        <w:pStyle w:val="Caption"/>
+        <w:ind w:left="605"/>
+        <w:rPr>
+          <w:rFonts w:asciiTheme="minorHAnsi" w:hAnsiTheme="minorHAnsi" w:cstheme="minorHAnsi"/>
+          <w:lang w:val="en-US"/>
+        </w:rPr>
+      </w:pPr>
+      <w:r>
+        <w:tab/>
+      </w:r>
       <w:r>
         <w:tab/>
       </w:r>
@@ -2678,13 +2936,1501 @@
         <w:rPr>
           <w:noProof/>
         </w:rPr>
-        <w:t>5</w:t>
+        <w:t>6</w:t>
       </w:r>
       <w:r>
         <w:fldChar w:fldCharType="end"/>
       </w:r>
       <w:r>
-        <w:t>: image 1 output after processing</w:t>
+        <w:t>:orginal image2</w:t>
+      </w:r>
+      <w:r>
+        <w:rPr>
+          <w:noProof/>
+        </w:rPr>
+        <w:t>.jpg</w:t>
+      </w:r>
+    </w:p>
+    <w:p>
+      <w:pPr>
+        <w:ind w:left="605"/>
+        <w:rPr>
+          <w:rFonts w:asciiTheme="minorHAnsi" w:hAnsiTheme="minorHAnsi" w:cstheme="minorHAnsi"/>
+          <w:lang w:val="en-US"/>
+        </w:rPr>
+      </w:pPr>
+    </w:p>
+    <w:p>
+      <w:pPr>
+        <w:ind w:left="605"/>
+        <w:rPr>
+          <w:rFonts w:asciiTheme="minorHAnsi" w:hAnsiTheme="minorHAnsi" w:cstheme="minorHAnsi"/>
+          <w:lang w:val="en-US"/>
+        </w:rPr>
+      </w:pPr>
+      <w:r>
+        <w:rPr>
+          <w:rFonts w:asciiTheme="minorHAnsi" w:hAnsiTheme="minorHAnsi" w:cstheme="minorHAnsi"/>
+          <w:lang w:val="en-US"/>
+        </w:rPr>
+        <w:t xml:space="preserve">Step 2 </w:t>
+      </w:r>
+      <w:r>
+        <w:rPr>
+          <w:rFonts w:asciiTheme="minorHAnsi" w:hAnsiTheme="minorHAnsi" w:cstheme="minorHAnsi"/>
+          <w:lang w:val="en-US"/>
+        </w:rPr>
+        <w:t>-</w:t>
+      </w:r>
+      <w:r>
+        <w:rPr>
+          <w:rFonts w:asciiTheme="minorHAnsi" w:hAnsiTheme="minorHAnsi" w:cstheme="minorHAnsi"/>
+          <w:lang w:val="en-US"/>
+        </w:rPr>
+        <w:t xml:space="preserve"> Grayscale Conversion and Histogram Analysis: </w:t>
+      </w:r>
+    </w:p>
+    <w:p>
+      <w:pPr>
+        <w:ind w:left="605"/>
+        <w:rPr>
+          <w:rFonts w:asciiTheme="minorHAnsi" w:hAnsiTheme="minorHAnsi" w:cstheme="minorHAnsi"/>
+          <w:lang w:val="en-US"/>
+        </w:rPr>
+      </w:pPr>
+      <w:r>
+        <w:rPr>
+          <w:rFonts w:asciiTheme="minorHAnsi" w:hAnsiTheme="minorHAnsi" w:cstheme="minorHAnsi"/>
+          <w:lang w:val="en-US"/>
+        </w:rPr>
+        <w:t>The image was converted to grayscale and its histogram was plotted to examine intensity distribution and confirm loss of sharp detail due to blur.</w:t>
+      </w:r>
+    </w:p>
+    <w:p>
+      <w:pPr>
+        <w:keepNext/>
+        <w:ind w:left="605"/>
+      </w:pPr>
+      <w:r>
+        <w:rPr>
+          <w:rFonts w:asciiTheme="minorHAnsi" w:hAnsiTheme="minorHAnsi" w:cstheme="minorHAnsi"/>
+          <w:noProof/>
+          <w:lang w:val="en-US"/>
+        </w:rPr>
+        <w:lastRenderedPageBreak/>
+        <w:drawing>
+          <wp:inline distT="0" distB="0" distL="0" distR="0" wp14:anchorId="7E6349E6" wp14:editId="4216EAC6">
+            <wp:extent cx="5516880" cy="3345180"/>
+            <wp:effectExtent l="0" t="0" r="7620" b="7620"/>
+            <wp:docPr id="2039540168" name="Picture 1"/>
+            <wp:cNvGraphicFramePr>
+              <a:graphicFrameLocks xmlns:a="http://schemas.openxmlformats.org/drawingml/2006/main" noChangeAspect="1"/>
+            </wp:cNvGraphicFramePr>
+            <a:graphic xmlns:a="http://schemas.openxmlformats.org/drawingml/2006/main">
+              <a:graphicData uri="http://schemas.openxmlformats.org/drawingml/2006/picture">
+                <pic:pic xmlns:pic="http://schemas.openxmlformats.org/drawingml/2006/picture">
+                  <pic:nvPicPr>
+                    <pic:cNvPr id="2039540168" name=""/>
+                    <pic:cNvPicPr/>
+                  </pic:nvPicPr>
+                  <pic:blipFill>
+                    <a:blip r:embed="rId12"/>
+                    <a:stretch>
+                      <a:fillRect/>
+                    </a:stretch>
+                  </pic:blipFill>
+                  <pic:spPr>
+                    <a:xfrm>
+                      <a:off x="0" y="0"/>
+                      <a:ext cx="5516880" cy="3345180"/>
+                    </a:xfrm>
+                    <a:prstGeom prst="rect">
+                      <a:avLst/>
+                    </a:prstGeom>
+                  </pic:spPr>
+                </pic:pic>
+              </a:graphicData>
+            </a:graphic>
+          </wp:inline>
+        </w:drawing>
+      </w:r>
+    </w:p>
+    <w:p>
+      <w:pPr>
+        <w:pStyle w:val="Caption"/>
+        <w:ind w:left="605"/>
+        <w:rPr>
+          <w:rFonts w:asciiTheme="minorHAnsi" w:hAnsiTheme="minorHAnsi" w:cstheme="minorHAnsi"/>
+          <w:lang w:val="en-US"/>
+        </w:rPr>
+      </w:pPr>
+      <w:r>
+        <w:tab/>
+      </w:r>
+      <w:r>
+        <w:tab/>
+      </w:r>
+      <w:r>
+        <w:tab/>
+        <w:t xml:space="preserve">Figure </w:t>
+      </w:r>
+      <w:r>
+        <w:fldChar w:fldCharType="begin"/>
+      </w:r>
+      <w:r>
+        <w:instrText xml:space="preserve"> SEQ Figure \* ARABIC </w:instrText>
+      </w:r>
+      <w:r>
+        <w:fldChar w:fldCharType="separate"/>
+      </w:r>
+      <w:r>
+        <w:rPr>
+          <w:noProof/>
+        </w:rPr>
+        <w:t>7</w:t>
+      </w:r>
+      <w:r>
+        <w:fldChar w:fldCharType="end"/>
+      </w:r>
+      <w:r>
+        <w:t xml:space="preserve"> : histogram and grayscale image of image2.jpg</w:t>
+      </w:r>
+    </w:p>
+    <w:p>
+      <w:pPr>
+        <w:ind w:left="605"/>
+        <w:rPr>
+          <w:rFonts w:asciiTheme="minorHAnsi" w:hAnsiTheme="minorHAnsi" w:cstheme="minorHAnsi"/>
+          <w:lang w:val="en-US"/>
+        </w:rPr>
+      </w:pPr>
+    </w:p>
+    <w:p>
+      <w:pPr>
+        <w:ind w:left="605"/>
+        <w:rPr>
+          <w:rFonts w:asciiTheme="minorHAnsi" w:hAnsiTheme="minorHAnsi" w:cstheme="minorHAnsi"/>
+          <w:lang w:val="en-US"/>
+        </w:rPr>
+      </w:pPr>
+      <w:r>
+        <w:rPr>
+          <w:rFonts w:asciiTheme="minorHAnsi" w:hAnsiTheme="minorHAnsi" w:cstheme="minorHAnsi"/>
+          <w:lang w:val="en-US"/>
+        </w:rPr>
+        <w:t xml:space="preserve">Step 3 </w:t>
+      </w:r>
+      <w:r>
+        <w:rPr>
+          <w:rFonts w:asciiTheme="minorHAnsi" w:hAnsiTheme="minorHAnsi" w:cstheme="minorHAnsi"/>
+          <w:lang w:val="en-US"/>
+        </w:rPr>
+        <w:t>-</w:t>
+      </w:r>
+      <w:r>
+        <w:rPr>
+          <w:rFonts w:asciiTheme="minorHAnsi" w:hAnsiTheme="minorHAnsi" w:cstheme="minorHAnsi"/>
+          <w:lang w:val="en-US"/>
+        </w:rPr>
+        <w:t xml:space="preserve"> Image Sharpening: </w:t>
+      </w:r>
+    </w:p>
+    <w:p>
+      <w:pPr>
+        <w:ind w:left="605"/>
+        <w:rPr>
+          <w:rFonts w:asciiTheme="minorHAnsi" w:hAnsiTheme="minorHAnsi" w:cstheme="minorHAnsi"/>
+          <w:lang w:val="en-US"/>
+        </w:rPr>
+      </w:pPr>
+      <w:r>
+        <w:rPr>
+          <w:rFonts w:asciiTheme="minorHAnsi" w:hAnsiTheme="minorHAnsi" w:cstheme="minorHAnsi"/>
+          <w:lang w:val="en-US"/>
+        </w:rPr>
+        <w:t xml:space="preserve">The blurred image was enhanced using </w:t>
+      </w:r>
+      <w:proofErr w:type="spellStart"/>
+      <w:r>
+        <w:rPr>
+          <w:rFonts w:asciiTheme="minorHAnsi" w:hAnsiTheme="minorHAnsi" w:cstheme="minorHAnsi"/>
+          <w:lang w:val="en-US"/>
+        </w:rPr>
+        <w:t>imsharpen</w:t>
+      </w:r>
+      <w:proofErr w:type="spellEnd"/>
+      <w:r>
+        <w:rPr>
+          <w:rFonts w:asciiTheme="minorHAnsi" w:hAnsiTheme="minorHAnsi" w:cstheme="minorHAnsi"/>
+          <w:lang w:val="en-US"/>
+        </w:rPr>
+        <w:t xml:space="preserve">() with Radius </w:t>
+      </w:r>
+      <w:r>
+        <w:rPr>
+          <w:rFonts w:asciiTheme="minorHAnsi" w:hAnsiTheme="minorHAnsi" w:cstheme="minorHAnsi"/>
+          <w:lang w:val="en-US"/>
+        </w:rPr>
+        <w:t>=</w:t>
+      </w:r>
+      <w:r>
+        <w:rPr>
+          <w:rFonts w:asciiTheme="minorHAnsi" w:hAnsiTheme="minorHAnsi" w:cstheme="minorHAnsi"/>
+          <w:lang w:val="en-US"/>
+        </w:rPr>
+        <w:t xml:space="preserve"> 3 and Amount = 2 to improve edge clarity and restore visible details.</w:t>
+      </w:r>
+    </w:p>
+    <w:p>
+      <w:pPr>
+        <w:keepNext/>
+        <w:ind w:left="605"/>
+      </w:pPr>
+      <w:r>
+        <w:rPr>
+          <w:rFonts w:asciiTheme="minorHAnsi" w:hAnsiTheme="minorHAnsi" w:cstheme="minorHAnsi"/>
+          <w:noProof/>
+          <w:lang w:val="en-US"/>
+        </w:rPr>
+        <w:drawing>
+          <wp:inline distT="0" distB="0" distL="0" distR="0" wp14:anchorId="04398F44" wp14:editId="2F39D54F">
+            <wp:extent cx="5516880" cy="2174240"/>
+            <wp:effectExtent l="0" t="0" r="7620" b="0"/>
+            <wp:docPr id="1029636815" name="Picture 1"/>
+            <wp:cNvGraphicFramePr>
+              <a:graphicFrameLocks xmlns:a="http://schemas.openxmlformats.org/drawingml/2006/main" noChangeAspect="1"/>
+            </wp:cNvGraphicFramePr>
+            <a:graphic xmlns:a="http://schemas.openxmlformats.org/drawingml/2006/main">
+              <a:graphicData uri="http://schemas.openxmlformats.org/drawingml/2006/picture">
+                <pic:pic xmlns:pic="http://schemas.openxmlformats.org/drawingml/2006/picture">
+                  <pic:nvPicPr>
+                    <pic:cNvPr id="1029636815" name=""/>
+                    <pic:cNvPicPr/>
+                  </pic:nvPicPr>
+                  <pic:blipFill>
+                    <a:blip r:embed="rId13"/>
+                    <a:stretch>
+                      <a:fillRect/>
+                    </a:stretch>
+                  </pic:blipFill>
+                  <pic:spPr>
+                    <a:xfrm>
+                      <a:off x="0" y="0"/>
+                      <a:ext cx="5516880" cy="2174240"/>
+                    </a:xfrm>
+                    <a:prstGeom prst="rect">
+                      <a:avLst/>
+                    </a:prstGeom>
+                  </pic:spPr>
+                </pic:pic>
+              </a:graphicData>
+            </a:graphic>
+          </wp:inline>
+        </w:drawing>
+      </w:r>
+    </w:p>
+    <w:p>
+      <w:pPr>
+        <w:pStyle w:val="Caption"/>
+        <w:ind w:left="605"/>
+        <w:rPr>
+          <w:rFonts w:asciiTheme="minorHAnsi" w:hAnsiTheme="minorHAnsi" w:cstheme="minorHAnsi"/>
+          <w:lang w:val="en-US"/>
+        </w:rPr>
+      </w:pPr>
+      <w:r>
+        <w:tab/>
+      </w:r>
+      <w:r>
+        <w:tab/>
+      </w:r>
+      <w:r>
+        <w:tab/>
+      </w:r>
+      <w:r>
+        <w:tab/>
+        <w:t xml:space="preserve">Figure </w:t>
+      </w:r>
+      <w:r>
+        <w:fldChar w:fldCharType="begin"/>
+      </w:r>
+      <w:r>
+        <w:instrText xml:space="preserve"> SEQ Figure \* ARABIC </w:instrText>
+      </w:r>
+      <w:r>
+        <w:fldChar w:fldCharType="separate"/>
+      </w:r>
+      <w:r>
+        <w:rPr>
+          <w:noProof/>
+        </w:rPr>
+        <w:t>8</w:t>
+      </w:r>
+      <w:r>
+        <w:fldChar w:fldCharType="end"/>
+      </w:r>
+      <w:r>
+        <w:t xml:space="preserve"> : output after image sharpening</w:t>
+      </w:r>
+    </w:p>
+    <w:p>
+      <w:pPr>
+        <w:ind w:left="605"/>
+        <w:rPr>
+          <w:rFonts w:asciiTheme="minorHAnsi" w:hAnsiTheme="minorHAnsi" w:cstheme="minorHAnsi"/>
+          <w:lang w:val="en-US"/>
+        </w:rPr>
+      </w:pPr>
+    </w:p>
+    <w:p>
+      <w:pPr>
+        <w:ind w:left="605"/>
+        <w:rPr>
+          <w:rFonts w:asciiTheme="minorHAnsi" w:hAnsiTheme="minorHAnsi" w:cstheme="minorHAnsi"/>
+          <w:lang w:val="en-US"/>
+        </w:rPr>
+      </w:pPr>
+      <w:r>
+        <w:rPr>
+          <w:rFonts w:asciiTheme="minorHAnsi" w:hAnsiTheme="minorHAnsi" w:cstheme="minorHAnsi"/>
+          <w:lang w:val="en-US"/>
+        </w:rPr>
+        <w:t xml:space="preserve">Step 4 </w:t>
+      </w:r>
+      <w:r>
+        <w:rPr>
+          <w:rFonts w:asciiTheme="minorHAnsi" w:hAnsiTheme="minorHAnsi" w:cstheme="minorHAnsi"/>
+          <w:lang w:val="en-US"/>
+        </w:rPr>
+        <w:t>-</w:t>
+      </w:r>
+      <w:r>
+        <w:rPr>
+          <w:rFonts w:asciiTheme="minorHAnsi" w:hAnsiTheme="minorHAnsi" w:cstheme="minorHAnsi"/>
+          <w:lang w:val="en-US"/>
+        </w:rPr>
+        <w:t xml:space="preserve"> Wiener Deconvolution (Gaussian Blur Model): </w:t>
+      </w:r>
+    </w:p>
+    <w:p>
+      <w:pPr>
+        <w:ind w:left="605"/>
+        <w:rPr>
+          <w:rFonts w:asciiTheme="minorHAnsi" w:hAnsiTheme="minorHAnsi" w:cstheme="minorHAnsi"/>
+          <w:lang w:val="en-US"/>
+        </w:rPr>
+      </w:pPr>
+      <w:r>
+        <w:rPr>
+          <w:rFonts w:asciiTheme="minorHAnsi" w:hAnsiTheme="minorHAnsi" w:cstheme="minorHAnsi"/>
+          <w:lang w:val="en-US"/>
+        </w:rPr>
+        <w:t>A Gaussian point spread function (15×15, σ = 5) was used with Wiener deconvolution to reduce blur and recover sharper structures.</w:t>
+      </w:r>
+    </w:p>
+    <w:p>
+      <w:pPr>
+        <w:keepNext/>
+        <w:ind w:left="605"/>
+      </w:pPr>
+      <w:r>
+        <w:rPr>
+          <w:rFonts w:asciiTheme="minorHAnsi" w:hAnsiTheme="minorHAnsi" w:cstheme="minorHAnsi"/>
+          <w:noProof/>
+          <w:lang w:val="en-US"/>
+        </w:rPr>
+        <w:lastRenderedPageBreak/>
+        <w:drawing>
+          <wp:inline distT="0" distB="0" distL="0" distR="0" wp14:anchorId="58B8F49D" wp14:editId="4A8D1EB9">
+            <wp:extent cx="5784273" cy="2600960"/>
+            <wp:effectExtent l="0" t="0" r="6985" b="8890"/>
+            <wp:docPr id="968063009" name="Picture 1"/>
+            <wp:cNvGraphicFramePr>
+              <a:graphicFrameLocks xmlns:a="http://schemas.openxmlformats.org/drawingml/2006/main" noChangeAspect="1"/>
+            </wp:cNvGraphicFramePr>
+            <a:graphic xmlns:a="http://schemas.openxmlformats.org/drawingml/2006/main">
+              <a:graphicData uri="http://schemas.openxmlformats.org/drawingml/2006/picture">
+                <pic:pic xmlns:pic="http://schemas.openxmlformats.org/drawingml/2006/picture">
+                  <pic:nvPicPr>
+                    <pic:cNvPr id="968063009" name=""/>
+                    <pic:cNvPicPr/>
+                  </pic:nvPicPr>
+                  <pic:blipFill>
+                    <a:blip r:embed="rId14"/>
+                    <a:stretch>
+                      <a:fillRect/>
+                    </a:stretch>
+                  </pic:blipFill>
+                  <pic:spPr>
+                    <a:xfrm>
+                      <a:off x="0" y="0"/>
+                      <a:ext cx="5786528" cy="2601974"/>
+                    </a:xfrm>
+                    <a:prstGeom prst="rect">
+                      <a:avLst/>
+                    </a:prstGeom>
+                  </pic:spPr>
+                </pic:pic>
+              </a:graphicData>
+            </a:graphic>
+          </wp:inline>
+        </w:drawing>
+      </w:r>
+    </w:p>
+    <w:p>
+      <w:pPr>
+        <w:pStyle w:val="Caption"/>
+        <w:ind w:left="605"/>
+        <w:rPr>
+          <w:rFonts w:asciiTheme="minorHAnsi" w:hAnsiTheme="minorHAnsi" w:cstheme="minorHAnsi"/>
+          <w:lang w:val="en-US"/>
+        </w:rPr>
+      </w:pPr>
+      <w:r>
+        <w:tab/>
+      </w:r>
+      <w:r>
+        <w:tab/>
+      </w:r>
+      <w:r>
+        <w:tab/>
+      </w:r>
+      <w:r>
+        <w:tab/>
+        <w:t xml:space="preserve">Figure </w:t>
+      </w:r>
+      <w:r>
+        <w:fldChar w:fldCharType="begin"/>
+      </w:r>
+      <w:r>
+        <w:instrText xml:space="preserve"> SEQ Figure \* ARABIC </w:instrText>
+      </w:r>
+      <w:r>
+        <w:fldChar w:fldCharType="separate"/>
+      </w:r>
+      <w:r>
+        <w:rPr>
+          <w:noProof/>
+        </w:rPr>
+        <w:t>9</w:t>
+      </w:r>
+      <w:r>
+        <w:fldChar w:fldCharType="end"/>
+      </w:r>
+      <w:r>
+        <w:t xml:space="preserve"> : Wiener Deconvolution</w:t>
+      </w:r>
+    </w:p>
+    <w:p>
+      <w:pPr>
+        <w:ind w:left="605"/>
+        <w:rPr>
+          <w:rFonts w:asciiTheme="minorHAnsi" w:hAnsiTheme="minorHAnsi" w:cstheme="minorHAnsi"/>
+          <w:lang w:val="en-US"/>
+        </w:rPr>
+      </w:pPr>
+    </w:p>
+    <w:p>
+      <w:pPr>
+        <w:ind w:left="605"/>
+        <w:rPr>
+          <w:rFonts w:asciiTheme="minorHAnsi" w:hAnsiTheme="minorHAnsi" w:cstheme="minorHAnsi"/>
+          <w:lang w:val="en-US"/>
+        </w:rPr>
+      </w:pPr>
+      <w:r>
+        <w:rPr>
+          <w:rFonts w:asciiTheme="minorHAnsi" w:hAnsiTheme="minorHAnsi" w:cstheme="minorHAnsi"/>
+          <w:lang w:val="en-US"/>
+        </w:rPr>
+        <w:t xml:space="preserve">Step 5 </w:t>
+      </w:r>
+      <w:r>
+        <w:rPr>
+          <w:rFonts w:asciiTheme="minorHAnsi" w:hAnsiTheme="minorHAnsi" w:cstheme="minorHAnsi"/>
+          <w:lang w:val="en-US"/>
+        </w:rPr>
+        <w:t>-</w:t>
+      </w:r>
+      <w:r>
+        <w:rPr>
+          <w:rFonts w:asciiTheme="minorHAnsi" w:hAnsiTheme="minorHAnsi" w:cstheme="minorHAnsi"/>
+          <w:lang w:val="en-US"/>
+        </w:rPr>
+        <w:t xml:space="preserve"> Motion Deconvolution Comparison: </w:t>
+      </w:r>
+    </w:p>
+    <w:p>
+      <w:pPr>
+        <w:ind w:left="605"/>
+        <w:rPr>
+          <w:rFonts w:asciiTheme="minorHAnsi" w:hAnsiTheme="minorHAnsi" w:cstheme="minorHAnsi"/>
+          <w:lang w:val="en-US"/>
+        </w:rPr>
+      </w:pPr>
+      <w:r>
+        <w:rPr>
+          <w:rFonts w:asciiTheme="minorHAnsi" w:hAnsiTheme="minorHAnsi" w:cstheme="minorHAnsi"/>
+          <w:lang w:val="en-US"/>
+        </w:rPr>
+        <w:t>A motion blur model was applied using Wiener deconvolution to compare restoration results under a different blur assumption.</w:t>
+      </w:r>
+    </w:p>
+    <w:p>
+      <w:pPr>
+        <w:keepNext/>
+        <w:ind w:left="605"/>
+      </w:pPr>
+      <w:r>
+        <w:rPr>
+          <w:rFonts w:asciiTheme="minorHAnsi" w:hAnsiTheme="minorHAnsi" w:cstheme="minorHAnsi"/>
+          <w:noProof/>
+          <w:lang w:val="en-US"/>
+        </w:rPr>
+        <w:drawing>
+          <wp:inline distT="0" distB="0" distL="0" distR="0" wp14:anchorId="22E08A6E" wp14:editId="1B2B7508">
+            <wp:extent cx="5158740" cy="2150745"/>
+            <wp:effectExtent l="0" t="0" r="3810" b="1905"/>
+            <wp:docPr id="1680025505" name="Picture 1"/>
+            <wp:cNvGraphicFramePr>
+              <a:graphicFrameLocks xmlns:a="http://schemas.openxmlformats.org/drawingml/2006/main" noChangeAspect="1"/>
+            </wp:cNvGraphicFramePr>
+            <a:graphic xmlns:a="http://schemas.openxmlformats.org/drawingml/2006/main">
+              <a:graphicData uri="http://schemas.openxmlformats.org/drawingml/2006/picture">
+                <pic:pic xmlns:pic="http://schemas.openxmlformats.org/drawingml/2006/picture">
+                  <pic:nvPicPr>
+                    <pic:cNvPr id="1680025505" name=""/>
+                    <pic:cNvPicPr/>
+                  </pic:nvPicPr>
+                  <pic:blipFill>
+                    <a:blip r:embed="rId15"/>
+                    <a:stretch>
+                      <a:fillRect/>
+                    </a:stretch>
+                  </pic:blipFill>
+                  <pic:spPr>
+                    <a:xfrm>
+                      <a:off x="0" y="0"/>
+                      <a:ext cx="5158740" cy="2150745"/>
+                    </a:xfrm>
+                    <a:prstGeom prst="rect">
+                      <a:avLst/>
+                    </a:prstGeom>
+                  </pic:spPr>
+                </pic:pic>
+              </a:graphicData>
+            </a:graphic>
+          </wp:inline>
+        </w:drawing>
+      </w:r>
+    </w:p>
+    <w:p>
+      <w:pPr>
+        <w:pStyle w:val="Caption"/>
+        <w:ind w:left="605"/>
+      </w:pPr>
+      <w:r>
+        <w:tab/>
+      </w:r>
+      <w:r>
+        <w:tab/>
+      </w:r>
+      <w:r>
+        <w:tab/>
+      </w:r>
+      <w:r>
+        <w:tab/>
+        <w:t xml:space="preserve">Figure </w:t>
+      </w:r>
+      <w:r>
+        <w:fldChar w:fldCharType="begin"/>
+      </w:r>
+      <w:r>
+        <w:instrText xml:space="preserve"> SEQ Figure \* ARABIC </w:instrText>
+      </w:r>
+      <w:r>
+        <w:fldChar w:fldCharType="separate"/>
+      </w:r>
+      <w:r>
+        <w:rPr>
+          <w:noProof/>
+        </w:rPr>
+        <w:t>10</w:t>
+      </w:r>
+      <w:r>
+        <w:fldChar w:fldCharType="end"/>
+      </w:r>
+      <w:r>
+        <w:t xml:space="preserve">: Motion </w:t>
+      </w:r>
+      <w:proofErr w:type="spellStart"/>
+      <w:r>
+        <w:t>Deconvulation</w:t>
+      </w:r>
+      <w:proofErr w:type="spellEnd"/>
+      <w:r>
+        <w:t xml:space="preserve"> </w:t>
+      </w:r>
+      <w:proofErr w:type="spellStart"/>
+      <w:r>
+        <w:t>comparision</w:t>
+      </w:r>
+      <w:proofErr w:type="spellEnd"/>
+    </w:p>
+    <w:p>
+      <w:pPr>
+        <w:pStyle w:val="Caption"/>
+        <w:ind w:left="605"/>
+        <w:rPr>
+          <w:rFonts w:asciiTheme="minorHAnsi" w:hAnsiTheme="minorHAnsi" w:cstheme="minorHAnsi"/>
+          <w:lang w:val="en-US"/>
+        </w:rPr>
+      </w:pPr>
+    </w:p>
+    <w:p>
+      <w:pPr>
+        <w:ind w:left="605"/>
+        <w:rPr>
+          <w:rFonts w:asciiTheme="minorHAnsi" w:hAnsiTheme="minorHAnsi" w:cstheme="minorHAnsi"/>
+          <w:lang w:val="en-US"/>
+        </w:rPr>
+      </w:pPr>
+      <w:r>
+        <w:rPr>
+          <w:rFonts w:asciiTheme="minorHAnsi" w:hAnsiTheme="minorHAnsi" w:cstheme="minorHAnsi"/>
+          <w:lang w:val="en-US"/>
+        </w:rPr>
+        <w:t xml:space="preserve">Step 6 </w:t>
+      </w:r>
+      <w:r>
+        <w:rPr>
+          <w:rFonts w:asciiTheme="minorHAnsi" w:hAnsiTheme="minorHAnsi" w:cstheme="minorHAnsi"/>
+          <w:lang w:val="en-US"/>
+        </w:rPr>
+        <w:t>-</w:t>
+      </w:r>
+      <w:r>
+        <w:rPr>
+          <w:rFonts w:asciiTheme="minorHAnsi" w:hAnsiTheme="minorHAnsi" w:cstheme="minorHAnsi"/>
+          <w:lang w:val="en-US"/>
+        </w:rPr>
+        <w:t xml:space="preserve"> Edge Detection Analysis: Sobel edge detection was performed before and after sharpening, showing significantly improved edge definition in the enhanced image.</w:t>
+      </w:r>
+    </w:p>
+    <w:p>
+      <w:pPr>
+        <w:keepNext/>
+        <w:ind w:left="605"/>
+      </w:pPr>
+      <w:r>
+        <w:rPr>
+          <w:rFonts w:asciiTheme="minorHAnsi" w:hAnsiTheme="minorHAnsi" w:cstheme="minorHAnsi"/>
+          <w:noProof/>
+          <w:lang w:val="en-US"/>
+        </w:rPr>
+        <w:lastRenderedPageBreak/>
+        <w:drawing>
+          <wp:inline distT="0" distB="0" distL="0" distR="0" wp14:anchorId="6D3569ED" wp14:editId="352DA7E1">
+            <wp:extent cx="5334000" cy="2296160"/>
+            <wp:effectExtent l="0" t="0" r="0" b="8890"/>
+            <wp:docPr id="1640712130" name="Picture 1"/>
+            <wp:cNvGraphicFramePr>
+              <a:graphicFrameLocks xmlns:a="http://schemas.openxmlformats.org/drawingml/2006/main" noChangeAspect="1"/>
+            </wp:cNvGraphicFramePr>
+            <a:graphic xmlns:a="http://schemas.openxmlformats.org/drawingml/2006/main">
+              <a:graphicData uri="http://schemas.openxmlformats.org/drawingml/2006/picture">
+                <pic:pic xmlns:pic="http://schemas.openxmlformats.org/drawingml/2006/picture">
+                  <pic:nvPicPr>
+                    <pic:cNvPr id="1640712130" name=""/>
+                    <pic:cNvPicPr/>
+                  </pic:nvPicPr>
+                  <pic:blipFill>
+                    <a:blip r:embed="rId16"/>
+                    <a:stretch>
+                      <a:fillRect/>
+                    </a:stretch>
+                  </pic:blipFill>
+                  <pic:spPr>
+                    <a:xfrm>
+                      <a:off x="0" y="0"/>
+                      <a:ext cx="5334000" cy="2296160"/>
+                    </a:xfrm>
+                    <a:prstGeom prst="rect">
+                      <a:avLst/>
+                    </a:prstGeom>
+                  </pic:spPr>
+                </pic:pic>
+              </a:graphicData>
+            </a:graphic>
+          </wp:inline>
+        </w:drawing>
+      </w:r>
+    </w:p>
+    <w:p>
+      <w:pPr>
+        <w:pStyle w:val="Caption"/>
+        <w:ind w:left="605"/>
+        <w:rPr>
+          <w:rFonts w:asciiTheme="minorHAnsi" w:hAnsiTheme="minorHAnsi" w:cstheme="minorHAnsi"/>
+          <w:lang w:val="en-US"/>
+        </w:rPr>
+      </w:pPr>
+      <w:r>
+        <w:tab/>
+      </w:r>
+      <w:r>
+        <w:tab/>
+      </w:r>
+      <w:r>
+        <w:tab/>
+      </w:r>
+      <w:r>
+        <w:tab/>
+      </w:r>
+      <w:r>
+        <w:tab/>
+        <w:t xml:space="preserve">Figure </w:t>
+      </w:r>
+      <w:r>
+        <w:fldChar w:fldCharType="begin"/>
+      </w:r>
+      <w:r>
+        <w:instrText xml:space="preserve"> SEQ Figure \* ARABIC </w:instrText>
+      </w:r>
+      <w:r>
+        <w:fldChar w:fldCharType="separate"/>
+      </w:r>
+      <w:r>
+        <w:rPr>
+          <w:noProof/>
+        </w:rPr>
+        <w:t>11</w:t>
+      </w:r>
+      <w:r>
+        <w:fldChar w:fldCharType="end"/>
+      </w:r>
+      <w:r>
+        <w:t>: edge detection</w:t>
+      </w:r>
+    </w:p>
+    <w:p>
+      <w:pPr>
+        <w:ind w:left="605"/>
+        <w:rPr>
+          <w:rFonts w:asciiTheme="minorHAnsi" w:hAnsiTheme="minorHAnsi" w:cstheme="minorHAnsi"/>
+        </w:rPr>
+      </w:pPr>
+    </w:p>
+    <w:p>
+      <w:pPr>
+        <w:pStyle w:val="Heading2"/>
+        <w:ind w:left="605"/>
+      </w:pPr>
+      <w:bookmarkStart w:id="5" w:name="_Toc229761577"/>
+      <w:r>
+        <w:t>2.3 A</w:t>
+      </w:r>
+      <w:r>
+        <w:t>nalysis and processing of Image3.bmp</w:t>
+      </w:r>
+      <w:bookmarkEnd w:id="5"/>
+    </w:p>
+    <w:p>
+      <w:pPr>
+        <w:ind w:left="605"/>
+        <w:rPr>
+          <w:rFonts w:asciiTheme="minorHAnsi" w:hAnsiTheme="minorHAnsi" w:cstheme="minorHAnsi"/>
+        </w:rPr>
+      </w:pPr>
+      <w:r>
+        <w:rPr>
+          <w:rFonts w:asciiTheme="minorHAnsi" w:hAnsiTheme="minorHAnsi" w:cstheme="minorHAnsi"/>
+        </w:rPr>
+        <w:t>Problem in the Image:</w:t>
+      </w:r>
+    </w:p>
+    <w:p>
+      <w:pPr>
+        <w:ind w:left="605"/>
+        <w:rPr>
+          <w:rFonts w:asciiTheme="minorHAnsi" w:hAnsiTheme="minorHAnsi" w:cstheme="minorHAnsi"/>
+        </w:rPr>
+      </w:pPr>
+      <w:r>
+        <w:rPr>
+          <w:rFonts w:asciiTheme="minorHAnsi" w:hAnsiTheme="minorHAnsi" w:cstheme="minorHAnsi"/>
+        </w:rPr>
+        <w:t>Image3 suffers from severe salt-and-pepper noise, where randomly scattered pure black and white pixels are spread densely across the entire image. The underlying subject, a car, is barely recognizable as the heavy noise corruption overwhelms fine details, edges, and textures throughout the scene.</w:t>
+      </w:r>
+    </w:p>
+    <w:p>
+      <w:pPr>
+        <w:ind w:left="605"/>
+        <w:rPr>
+          <w:rFonts w:asciiTheme="minorHAnsi" w:hAnsiTheme="minorHAnsi" w:cstheme="minorHAnsi"/>
+        </w:rPr>
+      </w:pPr>
+    </w:p>
+    <w:p>
+      <w:pPr>
+        <w:ind w:left="605"/>
+        <w:rPr>
+          <w:rFonts w:asciiTheme="minorHAnsi" w:hAnsiTheme="minorHAnsi" w:cstheme="minorHAnsi"/>
+        </w:rPr>
+      </w:pPr>
+      <w:r>
+        <w:rPr>
+          <w:rFonts w:asciiTheme="minorHAnsi" w:hAnsiTheme="minorHAnsi" w:cstheme="minorHAnsi"/>
+        </w:rPr>
+        <w:t>Solution Implemented:</w:t>
+      </w:r>
+    </w:p>
+    <w:p>
+      <w:pPr>
+        <w:ind w:left="605"/>
+        <w:rPr>
+          <w:rFonts w:asciiTheme="minorHAnsi" w:hAnsiTheme="minorHAnsi" w:cstheme="minorHAnsi"/>
+          <w:lang w:val="en-US"/>
+        </w:rPr>
+      </w:pPr>
+      <w:r>
+        <w:rPr>
+          <w:rFonts w:asciiTheme="minorHAnsi" w:hAnsiTheme="minorHAnsi" w:cstheme="minorHAnsi"/>
+          <w:lang w:val="en-US"/>
+        </w:rPr>
+        <w:t xml:space="preserve">Step 1 </w:t>
+      </w:r>
+      <w:r>
+        <w:rPr>
+          <w:rFonts w:asciiTheme="minorHAnsi" w:hAnsiTheme="minorHAnsi" w:cstheme="minorHAnsi"/>
+          <w:lang w:val="en-US"/>
+        </w:rPr>
+        <w:t>-</w:t>
+      </w:r>
+      <w:r>
+        <w:rPr>
+          <w:rFonts w:asciiTheme="minorHAnsi" w:hAnsiTheme="minorHAnsi" w:cstheme="minorHAnsi"/>
+          <w:lang w:val="en-US"/>
+        </w:rPr>
+        <w:t xml:space="preserve"> Image Loading and Display: </w:t>
+      </w:r>
+    </w:p>
+    <w:p>
+      <w:pPr>
+        <w:ind w:left="605"/>
+        <w:rPr>
+          <w:rFonts w:asciiTheme="minorHAnsi" w:hAnsiTheme="minorHAnsi" w:cstheme="minorHAnsi"/>
+          <w:lang w:val="en-US"/>
+        </w:rPr>
+      </w:pPr>
+      <w:r>
+        <w:rPr>
+          <w:rFonts w:asciiTheme="minorHAnsi" w:hAnsiTheme="minorHAnsi" w:cstheme="minorHAnsi"/>
+          <w:lang w:val="en-US"/>
+        </w:rPr>
+        <w:t>The input image containing salt-and-pepper noise was loaded and displayed to observe the noise characteristics.</w:t>
+      </w:r>
+    </w:p>
+    <w:p>
+      <w:pPr>
+        <w:keepNext/>
+        <w:ind w:left="605"/>
+      </w:pPr>
+      <w:r>
+        <w:rPr>
+          <w:rFonts w:asciiTheme="minorHAnsi" w:hAnsiTheme="minorHAnsi" w:cstheme="minorHAnsi"/>
+          <w:noProof/>
+          <w:lang w:val="en-US"/>
+        </w:rPr>
+        <w:lastRenderedPageBreak/>
+        <w:drawing>
+          <wp:inline distT="0" distB="0" distL="0" distR="0" wp14:anchorId="338E231A" wp14:editId="6EE57768">
+            <wp:extent cx="5410200" cy="3505200"/>
+            <wp:effectExtent l="0" t="0" r="0" b="0"/>
+            <wp:docPr id="251653646" name="Picture 1"/>
+            <wp:cNvGraphicFramePr>
+              <a:graphicFrameLocks xmlns:a="http://schemas.openxmlformats.org/drawingml/2006/main" noChangeAspect="1"/>
+            </wp:cNvGraphicFramePr>
+            <a:graphic xmlns:a="http://schemas.openxmlformats.org/drawingml/2006/main">
+              <a:graphicData uri="http://schemas.openxmlformats.org/drawingml/2006/picture">
+                <pic:pic xmlns:pic="http://schemas.openxmlformats.org/drawingml/2006/picture">
+                  <pic:nvPicPr>
+                    <pic:cNvPr id="251653646" name=""/>
+                    <pic:cNvPicPr/>
+                  </pic:nvPicPr>
+                  <pic:blipFill>
+                    <a:blip r:embed="rId17"/>
+                    <a:stretch>
+                      <a:fillRect/>
+                    </a:stretch>
+                  </pic:blipFill>
+                  <pic:spPr>
+                    <a:xfrm>
+                      <a:off x="0" y="0"/>
+                      <a:ext cx="5410200" cy="3505200"/>
+                    </a:xfrm>
+                    <a:prstGeom prst="rect">
+                      <a:avLst/>
+                    </a:prstGeom>
+                  </pic:spPr>
+                </pic:pic>
+              </a:graphicData>
+            </a:graphic>
+          </wp:inline>
+        </w:drawing>
+      </w:r>
+    </w:p>
+    <w:p>
+      <w:pPr>
+        <w:pStyle w:val="Caption"/>
+        <w:ind w:left="605"/>
+        <w:rPr>
+          <w:rFonts w:asciiTheme="minorHAnsi" w:hAnsiTheme="minorHAnsi" w:cstheme="minorHAnsi"/>
+          <w:lang w:val="en-US"/>
+        </w:rPr>
+      </w:pPr>
+      <w:r>
+        <w:tab/>
+      </w:r>
+      <w:r>
+        <w:tab/>
+      </w:r>
+      <w:r>
+        <w:tab/>
+      </w:r>
+      <w:r>
+        <w:tab/>
+      </w:r>
+      <w:r>
+        <w:tab/>
+        <w:t xml:space="preserve">Figure </w:t>
+      </w:r>
+      <w:r>
+        <w:fldChar w:fldCharType="begin"/>
+      </w:r>
+      <w:r>
+        <w:instrText xml:space="preserve"> SEQ Figure \* ARABIC </w:instrText>
+      </w:r>
+      <w:r>
+        <w:fldChar w:fldCharType="separate"/>
+      </w:r>
+      <w:r>
+        <w:rPr>
+          <w:noProof/>
+        </w:rPr>
+        <w:t>12</w:t>
+      </w:r>
+      <w:r>
+        <w:fldChar w:fldCharType="end"/>
+      </w:r>
+      <w:r>
+        <w:t xml:space="preserve">: </w:t>
+      </w:r>
+      <w:proofErr w:type="spellStart"/>
+      <w:r>
+        <w:t>orginal</w:t>
+      </w:r>
+      <w:proofErr w:type="spellEnd"/>
+      <w:r>
+        <w:t xml:space="preserve"> image3</w:t>
+      </w:r>
+    </w:p>
+    <w:p>
+      <w:pPr>
+        <w:ind w:left="605"/>
+        <w:rPr>
+          <w:rFonts w:asciiTheme="minorHAnsi" w:hAnsiTheme="minorHAnsi" w:cstheme="minorHAnsi"/>
+          <w:lang w:val="en-US"/>
+        </w:rPr>
+      </w:pPr>
+    </w:p>
+    <w:p>
+      <w:pPr>
+        <w:ind w:left="605"/>
+        <w:rPr>
+          <w:rFonts w:asciiTheme="minorHAnsi" w:hAnsiTheme="minorHAnsi" w:cstheme="minorHAnsi"/>
+          <w:lang w:val="en-US"/>
+        </w:rPr>
+      </w:pPr>
+      <w:r>
+        <w:rPr>
+          <w:rFonts w:asciiTheme="minorHAnsi" w:hAnsiTheme="minorHAnsi" w:cstheme="minorHAnsi"/>
+          <w:lang w:val="en-US"/>
+        </w:rPr>
+        <w:t xml:space="preserve">Step </w:t>
+      </w:r>
+      <w:r>
+        <w:rPr>
+          <w:rFonts w:asciiTheme="minorHAnsi" w:hAnsiTheme="minorHAnsi" w:cstheme="minorHAnsi"/>
+          <w:lang w:val="en-US"/>
+        </w:rPr>
+        <w:t>2</w:t>
+      </w:r>
+      <w:r>
+        <w:rPr>
+          <w:rFonts w:asciiTheme="minorHAnsi" w:hAnsiTheme="minorHAnsi" w:cstheme="minorHAnsi"/>
+          <w:lang w:val="en-US"/>
+        </w:rPr>
+        <w:t xml:space="preserve"> </w:t>
+      </w:r>
+      <w:r>
+        <w:rPr>
+          <w:rFonts w:asciiTheme="minorHAnsi" w:hAnsiTheme="minorHAnsi" w:cstheme="minorHAnsi"/>
+          <w:lang w:val="en-US"/>
+        </w:rPr>
+        <w:t>-</w:t>
+      </w:r>
+      <w:r>
+        <w:rPr>
+          <w:rFonts w:asciiTheme="minorHAnsi" w:hAnsiTheme="minorHAnsi" w:cstheme="minorHAnsi"/>
+          <w:lang w:val="en-US"/>
+        </w:rPr>
+        <w:t xml:space="preserve"> Median Filtering: A 3×3 median filter was applied using medfilt2() to effectively remove salt-and-pepper noise while preserving edges.</w:t>
+      </w:r>
+    </w:p>
+    <w:p>
+      <w:pPr>
+        <w:keepNext/>
+        <w:ind w:left="605"/>
+      </w:pPr>
+      <w:r>
+        <w:rPr>
+          <w:rFonts w:asciiTheme="minorHAnsi" w:hAnsiTheme="minorHAnsi" w:cstheme="minorHAnsi"/>
+          <w:noProof/>
+          <w:lang w:val="en-US"/>
+        </w:rPr>
+        <w:lastRenderedPageBreak/>
+        <w:drawing>
+          <wp:inline distT="0" distB="0" distL="0" distR="0" wp14:anchorId="7422BE40" wp14:editId="73E9859F">
+            <wp:extent cx="5196840" cy="4008120"/>
+            <wp:effectExtent l="0" t="0" r="3810" b="0"/>
+            <wp:docPr id="1727910696" name="Picture 1"/>
+            <wp:cNvGraphicFramePr>
+              <a:graphicFrameLocks xmlns:a="http://schemas.openxmlformats.org/drawingml/2006/main" noChangeAspect="1"/>
+            </wp:cNvGraphicFramePr>
+            <a:graphic xmlns:a="http://schemas.openxmlformats.org/drawingml/2006/main">
+              <a:graphicData uri="http://schemas.openxmlformats.org/drawingml/2006/picture">
+                <pic:pic xmlns:pic="http://schemas.openxmlformats.org/drawingml/2006/picture">
+                  <pic:nvPicPr>
+                    <pic:cNvPr id="615178923" name=""/>
+                    <pic:cNvPicPr/>
+                  </pic:nvPicPr>
+                  <pic:blipFill>
+                    <a:blip r:embed="rId18"/>
+                    <a:stretch>
+                      <a:fillRect/>
+                    </a:stretch>
+                  </pic:blipFill>
+                  <pic:spPr>
+                    <a:xfrm>
+                      <a:off x="0" y="0"/>
+                      <a:ext cx="5196840" cy="4008120"/>
+                    </a:xfrm>
+                    <a:prstGeom prst="rect">
+                      <a:avLst/>
+                    </a:prstGeom>
+                  </pic:spPr>
+                </pic:pic>
+              </a:graphicData>
+            </a:graphic>
+          </wp:inline>
+        </w:drawing>
+      </w:r>
+    </w:p>
+    <w:p>
+      <w:pPr>
+        <w:pStyle w:val="Caption"/>
+        <w:ind w:left="605"/>
+        <w:rPr>
+          <w:rFonts w:asciiTheme="minorHAnsi" w:hAnsiTheme="minorHAnsi" w:cstheme="minorHAnsi"/>
+          <w:lang w:val="en-US"/>
+        </w:rPr>
+      </w:pPr>
+      <w:r>
+        <w:tab/>
+      </w:r>
+      <w:r>
+        <w:tab/>
+      </w:r>
+      <w:r>
+        <w:tab/>
+      </w:r>
+      <w:r>
+        <w:tab/>
+      </w:r>
+      <w:r>
+        <w:tab/>
+        <w:t xml:space="preserve">Figure </w:t>
+      </w:r>
+      <w:r>
+        <w:fldChar w:fldCharType="begin"/>
+      </w:r>
+      <w:r>
+        <w:instrText xml:space="preserve"> SEQ Figure \* ARABIC </w:instrText>
+      </w:r>
+      <w:r>
+        <w:fldChar w:fldCharType="separate"/>
+      </w:r>
+      <w:r>
+        <w:rPr>
+          <w:noProof/>
+        </w:rPr>
+        <w:t>13</w:t>
+      </w:r>
+      <w:r>
+        <w:fldChar w:fldCharType="end"/>
+      </w:r>
+      <w:r>
+        <w:t xml:space="preserve"> : median filter</w:t>
+      </w:r>
+    </w:p>
+    <w:p>
+      <w:pPr>
+        <w:ind w:left="605"/>
+        <w:rPr>
+          <w:rFonts w:asciiTheme="minorHAnsi" w:hAnsiTheme="minorHAnsi" w:cstheme="minorHAnsi"/>
+          <w:lang w:val="en-US"/>
+        </w:rPr>
+      </w:pPr>
+    </w:p>
+    <w:p>
+      <w:pPr>
+        <w:ind w:left="605"/>
+        <w:rPr>
+          <w:rFonts w:asciiTheme="minorHAnsi" w:hAnsiTheme="minorHAnsi" w:cstheme="minorHAnsi"/>
+          <w:lang w:val="en-US"/>
+        </w:rPr>
+      </w:pPr>
+    </w:p>
+    <w:p>
+      <w:pPr>
+        <w:ind w:left="605"/>
+        <w:rPr>
+          <w:rFonts w:asciiTheme="minorHAnsi" w:hAnsiTheme="minorHAnsi" w:cstheme="minorHAnsi"/>
+          <w:lang w:val="en-US"/>
+        </w:rPr>
+      </w:pPr>
+      <w:r>
+        <w:rPr>
+          <w:rFonts w:asciiTheme="minorHAnsi" w:hAnsiTheme="minorHAnsi" w:cstheme="minorHAnsi"/>
+          <w:lang w:val="en-US"/>
+        </w:rPr>
+        <w:t xml:space="preserve">Step </w:t>
+      </w:r>
+      <w:r>
+        <w:rPr>
+          <w:rFonts w:asciiTheme="minorHAnsi" w:hAnsiTheme="minorHAnsi" w:cstheme="minorHAnsi"/>
+          <w:lang w:val="en-US"/>
+        </w:rPr>
+        <w:t>3</w:t>
+      </w:r>
+      <w:r>
+        <w:rPr>
+          <w:rFonts w:asciiTheme="minorHAnsi" w:hAnsiTheme="minorHAnsi" w:cstheme="minorHAnsi"/>
+          <w:lang w:val="en-US"/>
+        </w:rPr>
+        <w:t xml:space="preserve"> </w:t>
+      </w:r>
+      <w:r>
+        <w:rPr>
+          <w:rFonts w:asciiTheme="minorHAnsi" w:hAnsiTheme="minorHAnsi" w:cstheme="minorHAnsi"/>
+          <w:lang w:val="en-US"/>
+        </w:rPr>
+        <w:t>-</w:t>
+      </w:r>
+      <w:r>
+        <w:rPr>
+          <w:rFonts w:asciiTheme="minorHAnsi" w:hAnsiTheme="minorHAnsi" w:cstheme="minorHAnsi"/>
+          <w:lang w:val="en-US"/>
+        </w:rPr>
+        <w:t xml:space="preserve"> Average Filtering:</w:t>
+      </w:r>
+    </w:p>
+    <w:p>
+      <w:pPr>
+        <w:ind w:left="605"/>
+        <w:rPr>
+          <w:rFonts w:asciiTheme="minorHAnsi" w:hAnsiTheme="minorHAnsi" w:cstheme="minorHAnsi"/>
+          <w:lang w:val="en-US"/>
+        </w:rPr>
+      </w:pPr>
+      <w:r>
+        <w:rPr>
+          <w:rFonts w:asciiTheme="minorHAnsi" w:hAnsiTheme="minorHAnsi" w:cstheme="minorHAnsi"/>
+          <w:lang w:val="en-US"/>
+        </w:rPr>
+        <w:t>A 3×3 mean filter (</w:t>
+      </w:r>
+      <w:proofErr w:type="spellStart"/>
+      <w:r>
+        <w:rPr>
+          <w:rFonts w:asciiTheme="minorHAnsi" w:hAnsiTheme="minorHAnsi" w:cstheme="minorHAnsi"/>
+          <w:lang w:val="en-US"/>
+        </w:rPr>
+        <w:t>fspecial</w:t>
+      </w:r>
+      <w:proofErr w:type="spellEnd"/>
+      <w:r>
+        <w:rPr>
+          <w:rFonts w:asciiTheme="minorHAnsi" w:hAnsiTheme="minorHAnsi" w:cstheme="minorHAnsi"/>
+          <w:lang w:val="en-US"/>
+        </w:rPr>
+        <w:t xml:space="preserve">('average') with </w:t>
+      </w:r>
+      <w:proofErr w:type="spellStart"/>
+      <w:r>
+        <w:rPr>
+          <w:rFonts w:asciiTheme="minorHAnsi" w:hAnsiTheme="minorHAnsi" w:cstheme="minorHAnsi"/>
+          <w:lang w:val="en-US"/>
+        </w:rPr>
+        <w:t>imfilter</w:t>
+      </w:r>
+      <w:proofErr w:type="spellEnd"/>
+      <w:r>
+        <w:rPr>
+          <w:rFonts w:asciiTheme="minorHAnsi" w:hAnsiTheme="minorHAnsi" w:cstheme="minorHAnsi"/>
+          <w:lang w:val="en-US"/>
+        </w:rPr>
+        <w:t>) was used to smooth the image and reduce overall noise, though with some loss of sharpness.</w:t>
+      </w:r>
+    </w:p>
+    <w:p>
+      <w:pPr>
+        <w:keepNext/>
+        <w:ind w:left="605"/>
+      </w:pPr>
+      <w:r>
+        <w:rPr>
+          <w:rFonts w:asciiTheme="minorHAnsi" w:hAnsiTheme="minorHAnsi" w:cstheme="minorHAnsi"/>
+          <w:noProof/>
+          <w:lang w:val="en-US"/>
+        </w:rPr>
+        <w:lastRenderedPageBreak/>
+        <w:drawing>
+          <wp:inline distT="0" distB="0" distL="0" distR="0" wp14:anchorId="60B82603" wp14:editId="139727AB">
+            <wp:extent cx="4998720" cy="3863340"/>
+            <wp:effectExtent l="0" t="0" r="0" b="3810"/>
+            <wp:docPr id="362299084" name="Picture 1"/>
+            <wp:cNvGraphicFramePr>
+              <a:graphicFrameLocks xmlns:a="http://schemas.openxmlformats.org/drawingml/2006/main" noChangeAspect="1"/>
+            </wp:cNvGraphicFramePr>
+            <a:graphic xmlns:a="http://schemas.openxmlformats.org/drawingml/2006/main">
+              <a:graphicData uri="http://schemas.openxmlformats.org/drawingml/2006/picture">
+                <pic:pic xmlns:pic="http://schemas.openxmlformats.org/drawingml/2006/picture">
+                  <pic:nvPicPr>
+                    <pic:cNvPr id="362299084" name=""/>
+                    <pic:cNvPicPr/>
+                  </pic:nvPicPr>
+                  <pic:blipFill>
+                    <a:blip r:embed="rId19"/>
+                    <a:stretch>
+                      <a:fillRect/>
+                    </a:stretch>
+                  </pic:blipFill>
+                  <pic:spPr>
+                    <a:xfrm>
+                      <a:off x="0" y="0"/>
+                      <a:ext cx="4998720" cy="3863340"/>
+                    </a:xfrm>
+                    <a:prstGeom prst="rect">
+                      <a:avLst/>
+                    </a:prstGeom>
+                  </pic:spPr>
+                </pic:pic>
+              </a:graphicData>
+            </a:graphic>
+          </wp:inline>
+        </w:drawing>
+      </w:r>
+    </w:p>
+    <w:p>
+      <w:pPr>
+        <w:pStyle w:val="Caption"/>
+        <w:ind w:left="605"/>
+        <w:rPr>
+          <w:rFonts w:asciiTheme="minorHAnsi" w:hAnsiTheme="minorHAnsi" w:cstheme="minorHAnsi"/>
+          <w:lang w:val="en-US"/>
+        </w:rPr>
+      </w:pPr>
+      <w:r>
+        <w:tab/>
+      </w:r>
+      <w:r>
+        <w:tab/>
+      </w:r>
+      <w:r>
+        <w:tab/>
+      </w:r>
+      <w:r>
+        <w:tab/>
+      </w:r>
+      <w:r>
+        <w:tab/>
+        <w:t xml:space="preserve">Figure </w:t>
+      </w:r>
+      <w:r>
+        <w:fldChar w:fldCharType="begin"/>
+      </w:r>
+      <w:r>
+        <w:instrText xml:space="preserve"> SEQ Figure \* ARABIC </w:instrText>
+      </w:r>
+      <w:r>
+        <w:fldChar w:fldCharType="separate"/>
+      </w:r>
+      <w:r>
+        <w:rPr>
+          <w:noProof/>
+        </w:rPr>
+        <w:t>14</w:t>
+      </w:r>
+      <w:r>
+        <w:fldChar w:fldCharType="end"/>
+      </w:r>
+      <w:r>
+        <w:t xml:space="preserve"> : average filter</w:t>
+      </w:r>
+    </w:p>
+    <w:p>
+      <w:pPr>
+        <w:ind w:left="605"/>
+        <w:rPr>
+          <w:rFonts w:asciiTheme="minorHAnsi" w:hAnsiTheme="minorHAnsi" w:cstheme="minorHAnsi"/>
+          <w:lang w:val="en-US"/>
+        </w:rPr>
+      </w:pPr>
+    </w:p>
+    <w:p>
+      <w:pPr>
+        <w:ind w:left="605"/>
+        <w:rPr>
+          <w:rFonts w:asciiTheme="minorHAnsi" w:hAnsiTheme="minorHAnsi" w:cstheme="minorHAnsi"/>
+          <w:lang w:val="en-US"/>
+        </w:rPr>
+      </w:pPr>
+      <w:r>
+        <w:rPr>
+          <w:rFonts w:asciiTheme="minorHAnsi" w:hAnsiTheme="minorHAnsi" w:cstheme="minorHAnsi"/>
+          <w:lang w:val="en-US"/>
+        </w:rPr>
+        <w:t>Output</w:t>
+      </w:r>
+    </w:p>
+    <w:p>
+      <w:pPr>
+        <w:ind w:left="605"/>
+        <w:rPr>
+          <w:rFonts w:asciiTheme="minorHAnsi" w:hAnsiTheme="minorHAnsi" w:cstheme="minorHAnsi"/>
+          <w:lang w:val="en-US"/>
+        </w:rPr>
+      </w:pPr>
+      <w:r>
+        <w:rPr>
+          <w:rFonts w:asciiTheme="minorHAnsi" w:hAnsiTheme="minorHAnsi" w:cstheme="minorHAnsi"/>
+          <w:lang w:val="en-US"/>
+        </w:rPr>
+        <w:t>The original noisy image, median-filtered image, and average</w:t>
+      </w:r>
+      <w:r>
+        <w:rPr>
+          <w:rFonts w:asciiTheme="minorHAnsi" w:hAnsiTheme="minorHAnsi" w:cstheme="minorHAnsi"/>
+          <w:lang w:val="en-US"/>
+        </w:rPr>
+        <w:t xml:space="preserve"> </w:t>
+      </w:r>
+      <w:r>
+        <w:rPr>
+          <w:rFonts w:asciiTheme="minorHAnsi" w:hAnsiTheme="minorHAnsi" w:cstheme="minorHAnsi"/>
+          <w:lang w:val="en-US"/>
+        </w:rPr>
+        <w:t>filtered image were displayed side by side to compare the effectiveness of both noise reduction techniques.</w:t>
+      </w:r>
+    </w:p>
+    <w:p>
+      <w:pPr>
+        <w:keepNext/>
+        <w:ind w:left="605"/>
+      </w:pPr>
+      <w:r>
+        <w:rPr>
+          <w:rFonts w:asciiTheme="minorHAnsi" w:hAnsiTheme="minorHAnsi" w:cstheme="minorHAnsi"/>
+          <w:noProof/>
+          <w:lang w:val="en-US"/>
+        </w:rPr>
+        <w:drawing>
+          <wp:inline distT="0" distB="0" distL="0" distR="0" wp14:anchorId="28D99826" wp14:editId="3EAEB927">
+            <wp:extent cx="5334000" cy="2374265"/>
+            <wp:effectExtent l="0" t="0" r="0" b="6985"/>
+            <wp:docPr id="377884224" name="Picture 1"/>
+            <wp:cNvGraphicFramePr>
+              <a:graphicFrameLocks xmlns:a="http://schemas.openxmlformats.org/drawingml/2006/main" noChangeAspect="1"/>
+            </wp:cNvGraphicFramePr>
+            <a:graphic xmlns:a="http://schemas.openxmlformats.org/drawingml/2006/main">
+              <a:graphicData uri="http://schemas.openxmlformats.org/drawingml/2006/picture">
+                <pic:pic xmlns:pic="http://schemas.openxmlformats.org/drawingml/2006/picture">
+                  <pic:nvPicPr>
+                    <pic:cNvPr id="377884224" name=""/>
+                    <pic:cNvPicPr/>
+                  </pic:nvPicPr>
+                  <pic:blipFill>
+                    <a:blip r:embed="rId20"/>
+                    <a:stretch>
+                      <a:fillRect/>
+                    </a:stretch>
+                  </pic:blipFill>
+                  <pic:spPr>
+                    <a:xfrm>
+                      <a:off x="0" y="0"/>
+                      <a:ext cx="5334000" cy="2374265"/>
+                    </a:xfrm>
+                    <a:prstGeom prst="rect">
+                      <a:avLst/>
+                    </a:prstGeom>
+                  </pic:spPr>
+                </pic:pic>
+              </a:graphicData>
+            </a:graphic>
+          </wp:inline>
+        </w:drawing>
+      </w:r>
+    </w:p>
+    <w:p>
+      <w:pPr>
+        <w:pStyle w:val="Caption"/>
+        <w:ind w:left="605"/>
+      </w:pPr>
+      <w:r>
+        <w:tab/>
+      </w:r>
+      <w:r>
+        <w:tab/>
+      </w:r>
+      <w:r>
+        <w:tab/>
+      </w:r>
+      <w:r>
+        <w:tab/>
+        <w:t xml:space="preserve">Figure </w:t>
+      </w:r>
+      <w:r>
+        <w:fldChar w:fldCharType="begin"/>
+      </w:r>
+      <w:r>
+        <w:instrText xml:space="preserve"> SEQ Figure \* ARABIC </w:instrText>
+      </w:r>
+      <w:r>
+        <w:fldChar w:fldCharType="separate"/>
+      </w:r>
+      <w:r>
+        <w:rPr>
+          <w:noProof/>
+        </w:rPr>
+        <w:t>15</w:t>
+      </w:r>
+      <w:r>
+        <w:fldChar w:fldCharType="end"/>
+      </w:r>
+      <w:r>
+        <w:t xml:space="preserve"> : output of image 3 after processing</w:t>
       </w:r>
     </w:p>
     <w:p/>

</xml_diff>